<commit_message>
fix(cv): Astra-Review a2715d8 eingearbeitet
- Bewerbungs-Automation: Queue-Sperre 'unter Linux parallel geprueft',
  Rueckbau nur 'bei abgefangenen Fehlern' (kein Trap bei Ausfall/SIGKILL)
- 50 gemergte PRs gelten fuer Flowki Studio insgesamt, Schwerpunkt Clip-Studio
- 'bis zu drei' Schnittvarianten; '93 Python-Dateien, davon 55 Tests'
- jason.vcf: Titel und Standort angeglichen; n8n-Beleg (OBSIDAIRE) im Web-CV
- ATS-Druck: Absaetze nicht ueber den Seitenwechsel trennen
</commit_message>
<xml_diff>
--- a/ats-cv/Jason_Roschmann_CV_ATS.docx
+++ b/ats-cv/Jason_Roschmann_CV_ATS.docx
@@ -80,7 +80,7 @@
         <w:pStyle w:val="FirstParagraph"/>
       </w:pPr>
       <w:r>
-        <w:t xml:space="preserve">Internes Social-Media-Studio (Trends, Plattform-Playbooks, KI-Content-Pipeline). Mein Schwerpunkt: Clip-Verarbeitung, die aus Langvideos Shorts macht. 64 Pull Requests, davon 50 gemergt.</w:t>
+        <w:t xml:space="preserve">Internes Social-Media-Studio (Trends, Plattform-Playbooks, KI-Content-Pipeline). Mein Schwerpunkt: Clip-Verarbeitung, die aus Langvideos Shorts macht. 64 Pull Requests in Flowki Studio, davon 50 gemergt.</w:t>
       </w:r>
     </w:p>
     <w:p>
@@ -116,7 +116,7 @@
         </w:numPr>
       </w:pPr>
       <w:r>
-        <w:t xml:space="preserve">Drei Schnittvarianten je Clip, höchstens eine je Zielkonto (Datenbank-Constraint); Fixes für hängende Jobs und eine doppelt ausgelöste Produktion.</w:t>
+        <w:t xml:space="preserve">Bis zu drei Schnittvarianten je Clip, höchstens eine je Zielkonto (Datenbank-Constraint); Fixes für hängende Jobs und eine doppelt ausgelöste Produktion.</w:t>
       </w:r>
     </w:p>
     <w:p>
@@ -146,7 +146,7 @@
         <w:pStyle w:val="FirstParagraph"/>
       </w:pPr>
       <w:r>
-        <w:t xml:space="preserve">Python-Pipeline auf eigenem Linux-Server: Stellensuche über Job-APIs (u. a. Bundesagentur für Arbeit, Greenhouse, Lever), Analyse, Anschreiben, Endkontrolle, Mailversand, Antwort-Erkennung per IMAP. 93 Python-Module, 55 Testdateien.</w:t>
+        <w:t xml:space="preserve">Python-Pipeline auf eigenem Linux-Server: Stellensuche über Job-APIs (u. a. Bundesagentur für Arbeit, Greenhouse, Lever), Analyse, Anschreiben, Endkontrolle, Mailversand, Antwort-Erkennung per IMAP. 93 Python-Dateien, davon 55 Tests.</w:t>
       </w:r>
     </w:p>
     <w:p>
@@ -170,7 +170,7 @@
         </w:numPr>
       </w:pPr>
       <w:r>
-        <w:t xml:space="preserve">Nebenläufigkeit: sechs Queue-Schreiber unter einer gemeinsamen Dateisperre (flock). Rollouts halten alle 18 Cron-Locks, prüfen Prüfsummen, testen vor und nach dem Tausch und bauen bei jedem Fehler automatisch zurück.</w:t>
+        <w:t xml:space="preserve">Nebenläufigkeit: gemeinsame Dateisperre (flock) für sechs Queue-Schreiber, unter Linux mit parallelen Prozessen geprüft. Rollout-Skripte halten alle 18 Cron-Locks, prüfen Prüfsummen, testen vor und nach dem Tausch und bauen bei abgefangenen Fehlern automatisch zurück.</w:t>
       </w:r>
     </w:p>
     <w:p>

</xml_diff>

<commit_message>
feat(cv): Druck-CV v3 nach Recherche und Astra-Ranking
- Rolle DE/EN + Leitsatz 'KI-Automationen ... Verhalten ueberpruefbar'
- Kernstack-Leiste mit zwei Belegen (50 PRs, 21 -> 0); 18-Locks-Kachel raus
- Projekte: Zweck / Beitrag / Nachweis; Fallbeispiel Fehlersuche hermes-studio
  hervorgehoben; Bewerbungsverwaltung ohne Volumen, mit Eval-Entscheidung
- neuer Block 'Web- & Shop-Entwicklung fuer Kunden' (nk247, duftkumpels,
  Redesign-Entwurf) statt Einzelkarten
- Bildung sachlich ohne Negativsatz; QR-Code zum Web-CV
- ATS DE/EN inhaltsgleich, je 2 Seiten
</commit_message>
<xml_diff>
--- a/ats-cv/Jason_Roschmann_CV_ATS.docx
+++ b/ats-cv/Jason_Roschmann_CV_ATS.docx
@@ -2,7 +2,7 @@
 <file path=word/document.xml><?xml version="1.0" encoding="utf-8"?>
 <w:document xmlns:w="http://schemas.openxmlformats.org/wordprocessingml/2006/main" xmlns:m="http://schemas.openxmlformats.org/officeDocument/2006/math" xmlns:r="http://schemas.openxmlformats.org/officeDocument/2006/relationships" xmlns:o="urn:schemas-microsoft-com:office:office" xmlns:v="urn:schemas-microsoft-com:vml" xmlns:w10="urn:schemas-microsoft-com:office:word" xmlns:a="http://schemas.openxmlformats.org/drawingml/2006/main" xmlns:pic="http://schemas.openxmlformats.org/drawingml/2006/picture" xmlns:wp="http://schemas.openxmlformats.org/drawingml/2006/wordprocessingDrawing">
   <w:body>
-    <w:bookmarkStart w:id="23" w:name="jason-roschmann"/>
+    <w:bookmarkStart w:id="22" w:name="jason-roschmann"/>
     <w:p>
       <w:pPr>
         <w:pStyle w:val="Heading1"/>
@@ -16,7 +16,7 @@
         <w:pStyle w:val="FirstParagraph"/>
       </w:pPr>
       <w:r>
-        <w:t xml:space="preserve">KI-Automation &amp; Softwareentwicklung · Junior / Quereinstieg · Python · TypeScript</w:t>
+        <w:t xml:space="preserve">Junior Softwareentwickler / Software Engineer · KI-Automation</w:t>
       </w:r>
     </w:p>
     <w:p>
@@ -24,6 +24,14 @@
         <w:pStyle w:val="BodyText"/>
       </w:pPr>
       <w:r>
+        <w:t xml:space="preserve">Ich entwickle KI-Automationen – und mache ihr Verhalten überprüfbar.</w:t>
+      </w:r>
+    </w:p>
+    <w:p>
+      <w:pPr>
+        <w:pStyle w:val="BodyText"/>
+      </w:pPr>
+      <w:r>
         <w:t xml:space="preserve">E-Mail: jason@roschmann-digital.de | Telefon: +49 155 612 953 91</w:t>
       </w:r>
       <w:r>
@@ -39,6 +47,14 @@
         <w:t xml:space="preserve">Wohnort: Hamburg, Deutschland | Gesucht: Hamburg oder remote; Umzug nach Zürich für eine passende Rolle möglich | Start nach Absprache</w:t>
       </w:r>
     </w:p>
+    <w:p>
+      <w:pPr>
+        <w:pStyle w:val="BodyText"/>
+      </w:pPr>
+      <w:r>
+        <w:t xml:space="preserve">Kernstack: Python, FastAPI, TypeScript, React/Next.js, PostgreSQL, Docker</w:t>
+      </w:r>
+    </w:p>
     <w:bookmarkStart w:id="9" w:name="profil"/>
     <w:p>
       <w:pPr>
@@ -53,11 +69,11 @@
         <w:pStyle w:val="FirstParagraph"/>
       </w:pPr>
       <w:r>
-        <w:t xml:space="preserve">Ich baue KI-gestützte Automationen und Webanwendungen mit Python und TypeScript — in eigenen Projekten und im Team, vom Datenmodell bis zum Deployment. Am meisten interessieren mich die Fehlerfälle: doppelte Aktionen, hängende Jobs, stille Datenverluste, halbe Rollouts — und Tests, die genau diese Fälle festhalten. KI-Agenten sind mein Entwicklungswerkzeug; Anforderungen, Architekturentscheidungen und Abnahme liegen bei mir, und jeden Beitrag erkläre ich am Code. Vier Jahre B2B-Vertrieb haben mir beigebracht, zuerst das Problem zu verstehen. Ich suche eine Junior-Rolle in einem Entwicklungsteam.</w:t>
+        <w:t xml:space="preserve">Ich entwickle KI-Automationen und Webanwendungen mit Python und TypeScript, eigenständig und im Team. Meine Praxis umfasst API-Integration, Hintergrundjobs und gezielte Tests gegen doppelte Aktionen und Datenverlust. KI-Agenten nutze ich für die Umsetzung; Anforderungen und Abnahme meiner Beiträge verantworte ich selbst. Ich suche eine Junior-Rolle in KI-Automation oder Backend-/Fullstack-Entwicklung.</w:t>
       </w:r>
     </w:p>
     <w:bookmarkEnd w:id="9"/>
-    <w:bookmarkStart w:id="16" w:name="projekte"/>
+    <w:bookmarkStart w:id="13" w:name="projekte"/>
     <w:p>
       <w:pPr>
         <w:pStyle w:val="Heading2"/>
@@ -80,7 +96,7 @@
         <w:pStyle w:val="FirstParagraph"/>
       </w:pPr>
       <w:r>
-        <w:t xml:space="preserve">Internes Social-Media-Studio (Trends, Plattform-Playbooks, KI-Content-Pipeline). Mein Schwerpunkt: Clip-Verarbeitung, die aus Langvideos Shorts macht. 64 Pull Requests in Flowki Studio, davon 50 gemergt.</w:t>
+        <w:t xml:space="preserve">Zweck: Internes Social-Media-Studio mit Trends, Plattform-Playbooks und KI-Content-Pipeline. Das Clip-Studio macht aus Langvideos Shorts — mein Schwerpunkt. 64 Pull Requests in Flowki Studio, davon 50 gemergt.</w:t>
       </w:r>
     </w:p>
     <w:p>
@@ -92,7 +108,7 @@
         </w:numPr>
       </w:pPr>
       <w:r>
-        <w:t xml:space="preserve">Speaker-Reframe: Gesichtsmessung an mehreren Zeitpunkten statt einmal, geglättet zu stückweise konstanten 9:16-Keyframes — der Ausschnitt folgt der sprechenden Person.</w:t>
+        <w:t xml:space="preserve">Speaker-Reframe: Gesichtsposition an mehreren Zeitpunkten gemessen statt einmal, geglättet zu stückweise konstanten 9:16-Keyframes — der Ausschnitt folgt der sprechenden Person.</w:t>
       </w:r>
     </w:p>
     <w:p>
@@ -104,7 +120,7 @@
         </w:numPr>
       </w:pPr>
       <w:r>
-        <w:t xml:space="preserve">Deterministischer Neu-Render nach Korrekturen: append-only Planversionen, jede Änderung entwertet eine erteilte Freigabe; Render asynchron über Celery, ohne Modellkosten.</w:t>
+        <w:t xml:space="preserve">Deterministischer Neu-Render nach Korrekturen: append-only Planversionen, jede Planänderung entwertet eine erteilte Freigabe; Render asynchron über Celery, ohne Modellkosten.</w:t>
       </w:r>
     </w:p>
     <w:p>
@@ -132,13 +148,71 @@
       </w:r>
     </w:p>
     <w:bookmarkEnd w:id="10"/>
-    <w:bookmarkStart w:id="11" w:name="X3c025be72a1fb5855e2c1364bb2b29c236c9009"/>
+    <w:bookmarkStart w:id="11" w:name="Xa50e32cda60364fcaeabd82b96288ade70c29fe"/>
     <w:p>
       <w:pPr>
         <w:pStyle w:val="Heading3"/>
       </w:pPr>
       <w:r>
-        <w:t xml:space="preserve">Bewerbungs-Automation (Eigenprojekt, seit Juli 2026)</w:t>
+        <w:t xml:space="preserve">Fallbeispiel Fehlersuche — hermes-studio (Beitrag zu fremdem Projekt, Sep 2026)</w:t>
+      </w:r>
+    </w:p>
+    <w:p>
+      <w:pPr>
+        <w:pStyle w:val="Compact"/>
+        <w:numPr>
+          <w:ilvl w:val="0"/>
+          <w:numId w:val="1002"/>
+        </w:numPr>
+      </w:pPr>
+      <w:r>
+        <w:t xml:space="preserve">Ursache: 21 rote Tests, zwei Ursachen — 20× ein nie geschlossenes SQLite-Handle, das unter Windows das Aufräumen sperrt; 1× ein veralteter Test gegen eine Sicherheitsregel.</w:t>
+      </w:r>
+    </w:p>
+    <w:p>
+      <w:pPr>
+        <w:pStyle w:val="Compact"/>
+        <w:numPr>
+          <w:ilvl w:val="0"/>
+          <w:numId w:val="1002"/>
+        </w:numPr>
+      </w:pPr>
+      <w:r>
+        <w:t xml:space="preserve">Korrektur: Handle geschlossen, Sicherheitsregel behalten, Test korrigiert; dazu einen stillen Datenverlust im Task-Store behoben.</w:t>
+      </w:r>
+    </w:p>
+    <w:p>
+      <w:pPr>
+        <w:pStyle w:val="Compact"/>
+        <w:numPr>
+          <w:ilvl w:val="0"/>
+          <w:numId w:val="1002"/>
+        </w:numPr>
+      </w:pPr>
+      <w:r>
+        <w:t xml:space="preserve">Nachweis: Mutationsprobe — wird die Regel absichtlich gebrochen, schlägt der korrigierte Test an. Test-Suite von 177 auf 199 grüne Tests.</w:t>
+      </w:r>
+    </w:p>
+    <w:p>
+      <w:pPr>
+        <w:pStyle w:val="Compact"/>
+        <w:numPr>
+          <w:ilvl w:val="0"/>
+          <w:numId w:val="1002"/>
+        </w:numPr>
+      </w:pPr>
+      <w:r>
+        <w:t xml:space="preserve">So arbeite ich mit KI-Agenten: Fehler zuerst als roter Test, Agent setzt um, ein zweites Modell prüft zusätzlich als Reviewer, Rollout mit Prüfsummen und automatischem Rückbau.</w:t>
+      </w:r>
+    </w:p>
+    <w:bookmarkEnd w:id="11"/>
+    <w:bookmarkStart w:id="12" w:name="X4094cd3786f83d91073481ac877848284bc6906"/>
+    <w:p>
+      <w:pPr>
+        <w:pStyle w:val="Heading3"/>
+      </w:pPr>
+      <w:r>
+        <w:t xml:space="preserve">KI-gestützte Bewerbungsverwaltung (Eigenprojekt, seit Juli 2026)</w:t>
       </w:r>
     </w:p>
     <w:p>
@@ -146,15 +220,15 @@
         <w:pStyle w:val="FirstParagraph"/>
       </w:pPr>
       <w:r>
-        <w:t xml:space="preserve">Python-Pipeline auf eigenem Linux-Server: Stellensuche über Job-APIs (u. a. Bundesagentur für Arbeit, Greenhouse, Lever), Analyse, Anschreiben, Endkontrolle, Mailversand, Antwort-Erkennung per IMAP. 93 Python-Dateien, davon 55 Tests.</w:t>
-      </w:r>
-    </w:p>
-    <w:p>
-      <w:pPr>
-        <w:pStyle w:val="Compact"/>
-        <w:numPr>
-          <w:ilvl w:val="0"/>
-          <w:numId w:val="1002"/>
+        <w:t xml:space="preserve">Zweck: Python-Pipeline für Stellensuche über Job-APIs (u. a. Bundesagentur für Arbeit, Greenhouse, Lever), Anschreiben, Prüfungen, Versand und Antwortzuordnung. Schwerpunkt: nachvollziehbare Aktionen. 94 Python-Dateien, davon 56 Tests.</w:t>
+      </w:r>
+    </w:p>
+    <w:p>
+      <w:pPr>
+        <w:pStyle w:val="Compact"/>
+        <w:numPr>
+          <w:ilvl w:val="0"/>
+          <w:numId w:val="1003"/>
         </w:numPr>
       </w:pPr>
       <w:r>
@@ -166,45 +240,46 @@
         <w:pStyle w:val="Compact"/>
         <w:numPr>
           <w:ilvl w:val="0"/>
-          <w:numId w:val="1002"/>
-        </w:numPr>
-      </w:pPr>
-      <w:r>
-        <w:t xml:space="preserve">Nebenläufigkeit: gemeinsame Dateisperre (flock) für sechs Queue-Schreiber, unter Linux mit parallelen Prozessen geprüft. Rollout-Skripte halten alle 18 Cron-Locks, prüfen Prüfsummen, testen vor und nach dem Tausch und bauen bei abgefangenen Fehlern automatisch zurück.</w:t>
-      </w:r>
-    </w:p>
-    <w:p>
-      <w:pPr>
-        <w:pStyle w:val="Compact"/>
-        <w:numPr>
-          <w:ilvl w:val="0"/>
-          <w:numId w:val="1002"/>
-        </w:numPr>
-      </w:pPr>
-      <w:r>
-        <w:t xml:space="preserve">Fail-closed: Prüfer blockieren bei unbrauchbarer Modellantwort; Modell-Kaskade (Claude, Gemini, Groq) mit Sperrzeiten; ein Wächter meldet Stillstand.</w:t>
-      </w:r>
-    </w:p>
-    <w:p>
-      <w:pPr>
-        <w:pStyle w:val="Compact"/>
-        <w:numPr>
-          <w:ilvl w:val="0"/>
-          <w:numId w:val="1002"/>
-        </w:numPr>
-      </w:pPr>
-      <w:r>
-        <w:t xml:space="preserve">Arbeitsweise: jeder Fehler zuerst als roter Test, Review durch ein zweites Modell (Codex).</w:t>
-      </w:r>
-    </w:p>
-    <w:bookmarkEnd w:id="11"/>
-    <w:bookmarkStart w:id="12" w:name="duftkumpels.shop-shopify-seit-juni-2026"/>
-    <w:p>
-      <w:pPr>
-        <w:pStyle w:val="Heading3"/>
-      </w:pPr>
-      <w:r>
-        <w:t xml:space="preserve">duftkumpels.shop (Shopify, seit Juni 2026)</w:t>
+          <w:numId w:val="1003"/>
+        </w:numPr>
+      </w:pPr>
+      <w:r>
+        <w:t xml:space="preserve">Blockierende Prüfungen vor dem Versand: unbrauchbare Modellantworten stoppen den Lauf; Modell-Kaskade (Claude, Gemini, Groq) mit Sperrzeiten.</w:t>
+      </w:r>
+    </w:p>
+    <w:p>
+      <w:pPr>
+        <w:pStyle w:val="Compact"/>
+        <w:numPr>
+          <w:ilvl w:val="0"/>
+          <w:numId w:val="1003"/>
+        </w:numPr>
+      </w:pPr>
+      <w:r>
+        <w:t xml:space="preserve">LLM-Bewertungen gegen blinde Referenzurteile geprüft; eine überarbeitete Analyse nach unvollständiger Messung ohne belegte Verbesserung nicht ausgerollt.</w:t>
+      </w:r>
+    </w:p>
+    <w:p>
+      <w:pPr>
+        <w:pStyle w:val="Compact"/>
+        <w:numPr>
+          <w:ilvl w:val="0"/>
+          <w:numId w:val="1003"/>
+        </w:numPr>
+      </w:pPr>
+      <w:r>
+        <w:t xml:space="preserve">Rollouts mit Prüfsummen, Tests vor und nach dem Tausch und automatischem Rückbau.</w:t>
+      </w:r>
+    </w:p>
+    <w:bookmarkEnd w:id="12"/>
+    <w:bookmarkEnd w:id="13"/>
+    <w:bookmarkStart w:id="14" w:name="web--shop-entwicklung-für-kunden"/>
+    <w:p>
+      <w:pPr>
+        <w:pStyle w:val="Heading2"/>
+      </w:pPr>
+      <w:r>
+        <w:t xml:space="preserve">Web- &amp; Shop-Entwicklung für Kunden</w:t>
       </w:r>
     </w:p>
     <w:p>
@@ -212,66 +287,98 @@
         <w:pStyle w:val="FirstParagraph"/>
       </w:pPr>
       <w:r>
-        <w:t xml:space="preserve">Shop einer Hamburger Nischen-Parfümerie: gekauftes Prestige-Theme, in Liquid, CSS und JavaScript umgebaut. Eigene Design-Schicht im Live-Theme, dreisprachig (DE/EN/FR), Produktdaten über Metafields, wöchentliche Lighthouse-Prüfung gegen den Live-Shop per GitHub Actions.</w:t>
-      </w:r>
-    </w:p>
-    <w:bookmarkEnd w:id="12"/>
-    <w:bookmarkStart w:id="13" w:name="Xfa143dc6f5d50aa50f3d68b030ef0927cf8130f"/>
-    <w:p>
-      <w:pPr>
-        <w:pStyle w:val="Heading3"/>
-      </w:pPr>
-      <w:r>
-        <w:t xml:space="preserve">Werkzeuge für KI-Agenten — hermes-brett und hermes-studio (Sep 2026)</w:t>
-      </w:r>
-    </w:p>
-    <w:p>
-      <w:pPr>
-        <w:pStyle w:val="Compact"/>
-        <w:numPr>
-          <w:ilvl w:val="0"/>
-          <w:numId w:val="1003"/>
-        </w:numPr>
-      </w:pPr>
-      <w:r>
-        <w:t xml:space="preserve">hermes-brett: Aufgabenbrett-Plugin für Hermes Agent ohne Build-Schritt; ein Kosten-Gate verhindert versehentliche bezahlte Agentenläufe; Deploy mit Rollback; Selbsttest nur mit node:assert.</w:t>
-      </w:r>
-    </w:p>
-    <w:p>
-      <w:pPr>
-        <w:pStyle w:val="Compact"/>
-        <w:numPr>
-          <w:ilvl w:val="0"/>
-          <w:numId w:val="1003"/>
-        </w:numPr>
-      </w:pPr>
-      <w:r>
-        <w:t xml:space="preserve">hermes-studio (Beitrag zu einem fremden Projekt): 21 rote Tests auf die Ursache zurückgeführt — 20× ein nie geschlossenes SQLite-Handle, das unter Windows das Aufräumen sperrt; 1× ein veralteter Test gegen eine Sicherheitsregel: Code behalten, Test korrigiert, per Mutationsprobe abgesichert. Stillen Datenverlust im Task-Store behoben. Test-Suite von 177 auf 199 grüne Tests.</w:t>
-      </w:r>
-    </w:p>
-    <w:bookmarkEnd w:id="13"/>
-    <w:bookmarkStart w:id="14" w:name="Xf93217c5ef882fdb483e2fc23af2dafe98f7d4c"/>
-    <w:p>
-      <w:pPr>
-        <w:pStyle w:val="Heading3"/>
-      </w:pPr>
-      <w:r>
-        <w:t xml:space="preserve">nk247store.de — interaktive Überarbeitung (Kundenprojekt im Team, Aug–Sep 2026)</w:t>
-      </w:r>
-    </w:p>
-    <w:p>
-      <w:pPr>
-        <w:pStyle w:val="FirstParagraph"/>
-      </w:pPr>
-      <w:r>
-        <w:t xml:space="preserve">Website für einen 24/7-Automaten-Store (Next.js, GSAP). Live ist die erste Fassung des Teams; mein Teil ist eine interaktive Überarbeitung auf eigenem Branch, noch nicht veröffentlicht: Hero als Frame-Sequenz (Kopf dreht sich über 180° mit dem Mauszeiger, auf dem Handy per Geräteneigung), Vollbild-Kapitel mit eigener Mobile-Bedienung, Tabakwerbung nach § 19 TabakerzG entfernt. CI mit TypeScript-Check, ESLint, Vitest, Build und Playwright.</w:t>
+        <w:t xml:space="preserve">Websites und Shops für Kunden umgesetzt — von Gestaltung und Interaktion über Mehrsprachigkeit und rechtliche Vorgaben bis zu CI und Auslieferung.</w:t>
+      </w:r>
+    </w:p>
+    <w:p>
+      <w:pPr>
+        <w:pStyle w:val="Compact"/>
+        <w:numPr>
+          <w:ilvl w:val="0"/>
+          <w:numId w:val="1004"/>
+        </w:numPr>
+      </w:pPr>
+      <w:r>
+        <w:t xml:space="preserve">Frontend &amp; Interaktion: Next.js, React, TypeScript, GSAP — Hero als Frame-Sequenz, die sich mit dem Mauszeiger dreht (auf dem Handy per Geräteneigung); Vollbild-Kapitel mit eigener Mobile-Bedienung (nk247store.de).</w:t>
+      </w:r>
+    </w:p>
+    <w:p>
+      <w:pPr>
+        <w:pStyle w:val="Compact"/>
+        <w:numPr>
+          <w:ilvl w:val="0"/>
+          <w:numId w:val="1004"/>
+        </w:numPr>
+      </w:pPr>
+      <w:r>
+        <w:t xml:space="preserve">Shop &amp; Inhalte: gekauftes Shopify-Theme in Liquid, CSS und JavaScript umgebaut; eigene Design-Schicht im Live-Theme, dreisprachig (DE/EN/FR), Produktdaten über Metafields (duftkumpels.shop).</w:t>
+      </w:r>
+    </w:p>
+    <w:p>
+      <w:pPr>
+        <w:pStyle w:val="Compact"/>
+        <w:numPr>
+          <w:ilvl w:val="0"/>
+          <w:numId w:val="1004"/>
+        </w:numPr>
+      </w:pPr>
+      <w:r>
+        <w:t xml:space="preserve">Qualität &amp; Auslieferung: CI mit TypeScript-Check, ESLint, Vitest, Build und Playwright (nk247store.de); wöchentliche Lighthouse-Prüfung gegen den Live-Shop per GitHub Actions (duftkumpels.shop).</w:t>
+      </w:r>
+    </w:p>
+    <w:p>
+      <w:pPr>
+        <w:pStyle w:val="Compact"/>
+        <w:numPr>
+          <w:ilvl w:val="0"/>
+          <w:numId w:val="1004"/>
+        </w:numPr>
+      </w:pPr>
+      <w:r>
+        <w:t xml:space="preserve">Performance: versionierte Assets, Lade-Fallback, Performance-Runden gegen Ruckeln (nk247store.de).</w:t>
+      </w:r>
+    </w:p>
+    <w:p>
+      <w:pPr>
+        <w:pStyle w:val="Compact"/>
+        <w:numPr>
+          <w:ilvl w:val="0"/>
+          <w:numId w:val="1004"/>
+        </w:numPr>
+      </w:pPr>
+      <w:r>
+        <w:t xml:space="preserve">Recht &amp; Inhalte: Tabakwerbung nach § 19 TabakerzG aus allen Motiven entfernt (nk247store.de).</w:t>
+      </w:r>
+    </w:p>
+    <w:p>
+      <w:pPr>
+        <w:pStyle w:val="Compact"/>
+        <w:numPr>
+          <w:ilvl w:val="0"/>
+          <w:numId w:val="1004"/>
+        </w:numPr>
+      </w:pPr>
+      <w:r>
+        <w:t xml:space="preserve">KI-Werkzeuge: Design-Brief geschrieben, KI-Website-Builder gesteuert und selbst nachgearbeitet — Kamerafahrten aus echten Fotos, Farbkorrektur, Übergänge (Redesign-Entwurf für ein Hamburger Izakaya).</w:t>
+      </w:r>
+    </w:p>
+    <w:p>
+      <w:pPr>
+        <w:pStyle w:val="Compact"/>
+        <w:numPr>
+          <w:ilvl w:val="0"/>
+          <w:numId w:val="1004"/>
+        </w:numPr>
+      </w:pPr>
+      <w:r>
+        <w:t xml:space="preserve">Referenzen: duftkumpels.shop — live, seit Juni 2026; nk247store.de — Kundenprojekt im Team, meine Überarbeitung noch nicht veröffentlicht.</w:t>
       </w:r>
     </w:p>
     <w:bookmarkEnd w:id="14"/>
     <w:bookmarkStart w:id="15" w:name="weitere-projekte"/>
     <w:p>
       <w:pPr>
-        <w:pStyle w:val="Heading3"/>
+        <w:pStyle w:val="Heading2"/>
       </w:pPr>
       <w:r>
         <w:t xml:space="preserve">Weitere Projekte</w:t>
@@ -282,7 +389,19 @@
         <w:pStyle w:val="Compact"/>
         <w:numPr>
           <w:ilvl w:val="0"/>
-          <w:numId w:val="1004"/>
+          <w:numId w:val="1005"/>
+        </w:numPr>
+      </w:pPr>
+      <w:r>
+        <w:t xml:space="preserve">hermes-brett: Aufgabenbrett-Plugin für Hermes Agent ohne Build-Schritt; ein Kosten-Gate verhindert, dass das Brett versehentlich einen bezahlten Agentenlauf startet; Deploy mit Rollback; Selbsttest nur mit node:assert.</w:t>
+      </w:r>
+    </w:p>
+    <w:p>
+      <w:pPr>
+        <w:pStyle w:val="Compact"/>
+        <w:numPr>
+          <w:ilvl w:val="0"/>
+          <w:numId w:val="1005"/>
         </w:numPr>
       </w:pPr>
       <w:r>
@@ -294,7 +413,7 @@
         <w:pStyle w:val="Compact"/>
         <w:numPr>
           <w:ilvl w:val="0"/>
-          <w:numId w:val="1004"/>
+          <w:numId w:val="1005"/>
         </w:numPr>
       </w:pPr>
       <w:r>
@@ -302,8 +421,7 @@
       </w:r>
     </w:p>
     <w:bookmarkEnd w:id="15"/>
-    <w:bookmarkEnd w:id="16"/>
-    <w:bookmarkStart w:id="19" w:name="berufserfahrung"/>
+    <w:bookmarkStart w:id="18" w:name="berufserfahrung"/>
     <w:p>
       <w:pPr>
         <w:pStyle w:val="Heading2"/>
@@ -312,7 +430,7 @@
         <w:t xml:space="preserve">Berufserfahrung</w:t>
       </w:r>
     </w:p>
-    <w:bookmarkStart w:id="17" w:name="ki-automation-webentwicklung"/>
+    <w:bookmarkStart w:id="16" w:name="ki-automation-webentwicklung"/>
     <w:p>
       <w:pPr>
         <w:pStyle w:val="Heading3"/>
@@ -338,15 +456,15 @@
         <w:pStyle w:val="Compact"/>
         <w:numPr>
           <w:ilvl w:val="0"/>
-          <w:numId w:val="1005"/>
+          <w:numId w:val="1006"/>
         </w:numPr>
       </w:pPr>
       <w:r>
         <w:t xml:space="preserve">Python-Backends, Next.js-Frontends und Shopify-Themes entwickelt, getestet und auf Linux-Servern betrieben (Docker Compose, Cron, Deployment mit Rollback); im Team über Branches, Pull Requests und gemeinsame Test-Suites.</w:t>
       </w:r>
     </w:p>
-    <w:bookmarkEnd w:id="17"/>
-    <w:bookmarkStart w:id="18" w:name="b2b-direktvertrieb-door-to-door"/>
+    <w:bookmarkEnd w:id="16"/>
+    <w:bookmarkStart w:id="17" w:name="b2b-direktvertrieb-door-to-door"/>
     <w:p>
       <w:pPr>
         <w:pStyle w:val="Heading3"/>
@@ -372,7 +490,7 @@
         <w:pStyle w:val="Compact"/>
         <w:numPr>
           <w:ilvl w:val="0"/>
-          <w:numId w:val="1006"/>
+          <w:numId w:val="1007"/>
         </w:numPr>
       </w:pPr>
       <w:r>
@@ -384,190 +502,166 @@
         <w:pStyle w:val="Compact"/>
         <w:numPr>
           <w:ilvl w:val="0"/>
-          <w:numId w:val="1006"/>
+          <w:numId w:val="1007"/>
         </w:numPr>
       </w:pPr>
       <w:r>
         <w:t xml:space="preserve">Täglicher Umgang mit Absagen — und der Blick dafür, welche Probleme ein Betrieb wirklich hat.</w:t>
       </w:r>
     </w:p>
+    <w:bookmarkEnd w:id="17"/>
     <w:bookmarkEnd w:id="18"/>
+    <w:bookmarkStart w:id="19" w:name="weiterbildung-und-projektpraxis"/>
+    <w:p>
+      <w:pPr>
+        <w:pStyle w:val="Heading2"/>
+      </w:pPr>
+      <w:r>
+        <w:t xml:space="preserve">Weiterbildung und Projektpraxis</w:t>
+      </w:r>
+    </w:p>
+    <w:p>
+      <w:pPr>
+        <w:pStyle w:val="Compact"/>
+        <w:numPr>
+          <w:ilvl w:val="0"/>
+          <w:numId w:val="1008"/>
+        </w:numPr>
+      </w:pPr>
+      <w:r>
+        <w:t xml:space="preserve">Weiterbildung Webentwicklung, 2024 (6 Monate): HTML, CSS, JavaScript, Web-Architektur</w:t>
+      </w:r>
+    </w:p>
+    <w:p>
+      <w:pPr>
+        <w:pStyle w:val="Compact"/>
+        <w:numPr>
+          <w:ilvl w:val="0"/>
+          <w:numId w:val="1008"/>
+        </w:numPr>
+      </w:pPr>
+      <w:r>
+        <w:t xml:space="preserve">Google Ads Skillshop, Januar 2026: Search, Performance Max</w:t>
+      </w:r>
+    </w:p>
+    <w:p>
+      <w:pPr>
+        <w:pStyle w:val="Compact"/>
+        <w:numPr>
+          <w:ilvl w:val="0"/>
+          <w:numId w:val="1008"/>
+        </w:numPr>
+      </w:pPr>
+      <w:r>
+        <w:t xml:space="preserve">Laufende autodidaktische Weiterbildung anhand eigener und gemeinsamer Softwareprojekte</w:t>
+      </w:r>
+    </w:p>
     <w:bookmarkEnd w:id="19"/>
-    <w:bookmarkStart w:id="20" w:name="weiterbildung"/>
+    <w:bookmarkStart w:id="20" w:name="kenntnisse-in-projekten-eingesetzt"/>
     <w:p>
       <w:pPr>
         <w:pStyle w:val="Heading2"/>
       </w:pPr>
       <w:r>
-        <w:t xml:space="preserve">Weiterbildung</w:t>
-      </w:r>
-    </w:p>
-    <w:p>
-      <w:pPr>
-        <w:pStyle w:val="Compact"/>
-        <w:numPr>
-          <w:ilvl w:val="0"/>
-          <w:numId w:val="1007"/>
-        </w:numPr>
-      </w:pPr>
-      <w:r>
-        <w:t xml:space="preserve">Weiterbildung Webentwicklung, 2024 (6 Monate): HTML, CSS, JavaScript, Web-Architektur</w:t>
-      </w:r>
-    </w:p>
-    <w:p>
-      <w:pPr>
-        <w:pStyle w:val="Compact"/>
-        <w:numPr>
-          <w:ilvl w:val="0"/>
-          <w:numId w:val="1007"/>
-        </w:numPr>
-      </w:pPr>
-      <w:r>
-        <w:t xml:space="preserve">Google Ads Skillshop, Januar 2026: Search, Performance Max</w:t>
-      </w:r>
-    </w:p>
-    <w:p>
-      <w:pPr>
-        <w:pStyle w:val="Compact"/>
-        <w:numPr>
-          <w:ilvl w:val="0"/>
-          <w:numId w:val="1007"/>
-        </w:numPr>
-      </w:pPr>
-      <w:r>
-        <w:t xml:space="preserve">Kein Hochschulabschluss, keine abgeschlossene Berufsausbildung — Quereinstieg über Projektpraxis, laufend autodidaktisch</w:t>
+        <w:t xml:space="preserve">Kenntnisse (in Projekten eingesetzt)</w:t>
+      </w:r>
+    </w:p>
+    <w:p>
+      <w:pPr>
+        <w:pStyle w:val="Compact"/>
+        <w:numPr>
+          <w:ilvl w:val="0"/>
+          <w:numId w:val="1009"/>
+        </w:numPr>
+      </w:pPr>
+      <w:r>
+        <w:t xml:space="preserve">Entwicklung: Python, FastAPI, TypeScript, React, Next.js, React Native</w:t>
+      </w:r>
+    </w:p>
+    <w:p>
+      <w:pPr>
+        <w:pStyle w:val="Compact"/>
+        <w:numPr>
+          <w:ilvl w:val="0"/>
+          <w:numId w:val="1009"/>
+        </w:numPr>
+      </w:pPr>
+      <w:r>
+        <w:t xml:space="preserve">KI &amp; Agenten: Claude Code, LLM-APIs (Claude, Gemini, Groq), MCP, Agenten-Orchestrierung, n8n</w:t>
+      </w:r>
+    </w:p>
+    <w:p>
+      <w:pPr>
+        <w:pStyle w:val="Compact"/>
+        <w:numPr>
+          <w:ilvl w:val="0"/>
+          <w:numId w:val="1009"/>
+        </w:numPr>
+      </w:pPr>
+      <w:r>
+        <w:t xml:space="preserve">Daten &amp; Jobs: PostgreSQL, SQLAlchemy/Alembic, Celery, Redis, Supabase</w:t>
+      </w:r>
+    </w:p>
+    <w:p>
+      <w:pPr>
+        <w:pStyle w:val="Compact"/>
+        <w:numPr>
+          <w:ilvl w:val="0"/>
+          <w:numId w:val="1009"/>
+        </w:numPr>
+      </w:pPr>
+      <w:r>
+        <w:t xml:space="preserve">Qualität: pytest, Vitest, Playwright, GitHub Actions, Lighthouse-CI</w:t>
+      </w:r>
+    </w:p>
+    <w:p>
+      <w:pPr>
+        <w:pStyle w:val="Compact"/>
+        <w:numPr>
+          <w:ilvl w:val="0"/>
+          <w:numId w:val="1009"/>
+        </w:numPr>
+      </w:pPr>
+      <w:r>
+        <w:t xml:space="preserve">Betrieb: Linux-Server, Docker Compose, Cron, flock, SMTP/IMAP, SPF/DKIM</w:t>
+      </w:r>
+    </w:p>
+    <w:p>
+      <w:pPr>
+        <w:pStyle w:val="Compact"/>
+        <w:numPr>
+          <w:ilvl w:val="0"/>
+          <w:numId w:val="1009"/>
+        </w:numPr>
+      </w:pPr>
+      <w:r>
+        <w:t xml:space="preserve">Web &amp; Commerce: Shopify Liquid, Tailwind, GSAP, PWA, Canvas/WebGL</w:t>
       </w:r>
     </w:p>
     <w:bookmarkEnd w:id="20"/>
-    <w:bookmarkStart w:id="21" w:name="kenntnisse-in-projekten-eingesetzt"/>
+    <w:bookmarkStart w:id="21" w:name="sprachen"/>
     <w:p>
       <w:pPr>
         <w:pStyle w:val="Heading2"/>
       </w:pPr>
       <w:r>
-        <w:t xml:space="preserve">Kenntnisse (in Projekten eingesetzt)</w:t>
-      </w:r>
-    </w:p>
-    <w:p>
-      <w:pPr>
-        <w:pStyle w:val="Compact"/>
-        <w:numPr>
-          <w:ilvl w:val="0"/>
-          <w:numId w:val="1008"/>
-        </w:numPr>
-      </w:pPr>
-      <w:r>
-        <w:t xml:space="preserve">Entwicklung: Python, FastAPI, TypeScript, React, Next.js, React Native</w:t>
-      </w:r>
-    </w:p>
-    <w:p>
-      <w:pPr>
-        <w:pStyle w:val="Compact"/>
-        <w:numPr>
-          <w:ilvl w:val="0"/>
-          <w:numId w:val="1008"/>
-        </w:numPr>
-      </w:pPr>
-      <w:r>
-        <w:t xml:space="preserve">KI &amp; Agenten: Claude Code, Modell-APIs (Claude, Gemini, Groq), MCP, Agenten-Orchestrierung, n8n</w:t>
-      </w:r>
-    </w:p>
-    <w:p>
-      <w:pPr>
-        <w:pStyle w:val="Compact"/>
-        <w:numPr>
-          <w:ilvl w:val="0"/>
-          <w:numId w:val="1008"/>
-        </w:numPr>
-      </w:pPr>
-      <w:r>
-        <w:t xml:space="preserve">Daten &amp; Jobs: PostgreSQL, SQLAlchemy/Alembic, Celery, Redis, Supabase</w:t>
-      </w:r>
-    </w:p>
-    <w:p>
-      <w:pPr>
-        <w:pStyle w:val="Compact"/>
-        <w:numPr>
-          <w:ilvl w:val="0"/>
-          <w:numId w:val="1008"/>
-        </w:numPr>
-      </w:pPr>
-      <w:r>
-        <w:t xml:space="preserve">Qualität: pytest, Vitest, Playwright, GitHub Actions, Lighthouse-CI</w:t>
-      </w:r>
-    </w:p>
-    <w:p>
-      <w:pPr>
-        <w:pStyle w:val="Compact"/>
-        <w:numPr>
-          <w:ilvl w:val="0"/>
-          <w:numId w:val="1008"/>
-        </w:numPr>
-      </w:pPr>
-      <w:r>
-        <w:t xml:space="preserve">Betrieb: Linux-Server, Docker Compose, Cron, flock, SMTP/IMAP, SPF/DKIM</w:t>
-      </w:r>
-    </w:p>
-    <w:p>
-      <w:pPr>
-        <w:pStyle w:val="Compact"/>
-        <w:numPr>
-          <w:ilvl w:val="0"/>
-          <w:numId w:val="1008"/>
-        </w:numPr>
-      </w:pPr>
-      <w:r>
-        <w:t xml:space="preserve">Web &amp; Commerce: Shopify Liquid, Tailwind, GSAP, PWA, Canvas/WebGL</w:t>
+        <w:t xml:space="preserve">Sprachen</w:t>
+      </w:r>
+    </w:p>
+    <w:p>
+      <w:pPr>
+        <w:pStyle w:val="Compact"/>
+        <w:numPr>
+          <w:ilvl w:val="0"/>
+          <w:numId w:val="1010"/>
+        </w:numPr>
+      </w:pPr>
+      <w:r>
+        <w:t xml:space="preserve">Deutsch: Muttersprache · Englisch: B1, Richtung B2 · Polnisch: mündlich</w:t>
       </w:r>
     </w:p>
     <w:bookmarkEnd w:id="21"/>
-    <w:bookmarkStart w:id="22" w:name="sprachen"/>
-    <w:p>
-      <w:pPr>
-        <w:pStyle w:val="Heading2"/>
-      </w:pPr>
-      <w:r>
-        <w:t xml:space="preserve">Sprachen</w:t>
-      </w:r>
-    </w:p>
-    <w:p>
-      <w:pPr>
-        <w:pStyle w:val="Compact"/>
-        <w:numPr>
-          <w:ilvl w:val="0"/>
-          <w:numId w:val="1009"/>
-        </w:numPr>
-      </w:pPr>
-      <w:r>
-        <w:t xml:space="preserve">Deutsch: Muttersprache</w:t>
-      </w:r>
-    </w:p>
-    <w:p>
-      <w:pPr>
-        <w:pStyle w:val="Compact"/>
-        <w:numPr>
-          <w:ilvl w:val="0"/>
-          <w:numId w:val="1009"/>
-        </w:numPr>
-      </w:pPr>
-      <w:r>
-        <w:t xml:space="preserve">Englisch: B1, Richtung B2</w:t>
-      </w:r>
-    </w:p>
-    <w:p>
-      <w:pPr>
-        <w:pStyle w:val="Compact"/>
-        <w:numPr>
-          <w:ilvl w:val="0"/>
-          <w:numId w:val="1009"/>
-        </w:numPr>
-      </w:pPr>
-      <w:r>
-        <w:t xml:space="preserve">Polnisch: mündlich</w:t>
-      </w:r>
-    </w:p>
     <w:bookmarkEnd w:id="22"/>
-    <w:bookmarkEnd w:id="23"/>
     <w:sectPr>
       <w:footnotePr>
         <w:numRestart w:val="eachSect"/>
@@ -809,6 +903,9 @@
     <w:abstractNumId w:val="991"/>
   </w:num>
   <w:num w:numId="1009">
+    <w:abstractNumId w:val="991"/>
+  </w:num>
+  <w:num w:numId="1010">
     <w:abstractNumId w:val="991"/>
   </w:num>
 </w:numbering>

</xml_diff>

<commit_message>
fix(cv): Astra-Review 5c3204a eingearbeitet, englische Druckfassung
- duftkumpels: Projektarbeit seit Juni 2026 statt unbelegtem 'live seit Juni'
- Mutationsprobe praeziser; Task-Store-Fix als eigener Beitrag gekennzeichnet
- 56 Testdateien statt 56 Tests; QR-Text ohne unveroeffentlichte Fallstudien
- Beschriftung und Inhalt als ein Textabsatz: pdftotext liest Paare zusammen
- cv-print-en.html + Jason_Roschmann_CV_EN.pdf, gemeinsames cv-print.css
</commit_message>
<xml_diff>
--- a/ats-cv/Jason_Roschmann_CV_ATS.docx
+++ b/ats-cv/Jason_Roschmann_CV_ATS.docx
@@ -178,7 +178,7 @@
         </w:numPr>
       </w:pPr>
       <w:r>
-        <w:t xml:space="preserve">Korrektur: Handle geschlossen, Sicherheitsregel behalten, Test korrigiert; dazu einen stillen Datenverlust im Task-Store behoben.</w:t>
+        <w:t xml:space="preserve">Korrektur: Handle geschlossen, Sicherheitsregel behalten, Test korrigiert. Zusätzlich, als eigener Beitrag: stillen Datenverlust im Task-Store behoben, mit fünf neuen Tests.</w:t>
       </w:r>
     </w:p>
     <w:p>
@@ -190,7 +190,7 @@
         </w:numPr>
       </w:pPr>
       <w:r>
-        <w:t xml:space="preserve">Nachweis: Mutationsprobe — wird die Regel absichtlich gebrochen, schlägt der korrigierte Test an. Test-Suite von 177 auf 199 grüne Tests.</w:t>
+        <w:t xml:space="preserve">Nachweis: Mutationsprobe — eine gezielte Abschwächung der Sicherheitsregel ließ den korrigierten Test scheitern. Test-Suite von 177 auf 199 grüne Tests.</w:t>
       </w:r>
     </w:p>
     <w:p>
@@ -220,7 +220,7 @@
         <w:pStyle w:val="FirstParagraph"/>
       </w:pPr>
       <w:r>
-        <w:t xml:space="preserve">Zweck: Python-Pipeline für Stellensuche über Job-APIs (u. a. Bundesagentur für Arbeit, Greenhouse, Lever), Anschreiben, Prüfungen, Versand und Antwortzuordnung. Schwerpunkt: nachvollziehbare Aktionen. 94 Python-Dateien, davon 56 Tests.</w:t>
+        <w:t xml:space="preserve">Zweck: Python-Pipeline für Stellensuche über Job-APIs (u. a. Bundesagentur für Arbeit, Greenhouse, Lever), Anschreiben, Prüfungen, Versand und Antwortzuordnung. Schwerpunkt: nachvollziehbare Aktionen. 94 Python-Dateien, davon 56 Testdateien.</w:t>
       </w:r>
     </w:p>
     <w:p>
@@ -371,7 +371,7 @@
         </w:numPr>
       </w:pPr>
       <w:r>
-        <w:t xml:space="preserve">Referenzen: duftkumpels.shop — live, seit Juni 2026; nk247store.de — Kundenprojekt im Team, meine Überarbeitung noch nicht veröffentlicht.</w:t>
+        <w:t xml:space="preserve">Referenzen: duftkumpels.shop — Projektarbeit seit Juni 2026, Anpassungen im Live-Theme; nk247store.de — Kundenprojekt im Team, meine Überarbeitung noch nicht veröffentlicht.</w:t>
       </w:r>
     </w:p>
     <w:bookmarkEnd w:id="14"/>

</xml_diff>

<commit_message>
fix(cv): Google-Ads-Zertifikat auf den Nachweis korrigiert
Signierte OpenBadge-3-Credential (Skillshop/Accredible): Google Ads Search
Certification, ausgestellt 03.12.2025, gueltig bis 03.12.2026, ID 168246413.
Vorher seit b5473a7: 'Januar 2026: Search, Performance Max' - weder Monat noch
Performance Max belegt. Jetzt mit Verifizierungslink in Druck, ATS und Web.
</commit_message>
<xml_diff>
--- a/ats-cv/Jason_Roschmann_CV_ATS.docx
+++ b/ats-cv/Jason_Roschmann_CV_ATS.docx
@@ -2,7 +2,7 @@
 <file path=word/document.xml><?xml version="1.0" encoding="utf-8"?>
 <w:document xmlns:w="http://schemas.openxmlformats.org/wordprocessingml/2006/main" xmlns:m="http://schemas.openxmlformats.org/officeDocument/2006/math" xmlns:r="http://schemas.openxmlformats.org/officeDocument/2006/relationships" xmlns:o="urn:schemas-microsoft-com:office:office" xmlns:v="urn:schemas-microsoft-com:vml" xmlns:w10="urn:schemas-microsoft-com:office:word" xmlns:a="http://schemas.openxmlformats.org/drawingml/2006/main" xmlns:pic="http://schemas.openxmlformats.org/drawingml/2006/picture" xmlns:wp="http://schemas.openxmlformats.org/drawingml/2006/wordprocessingDrawing">
   <w:body>
-    <w:bookmarkStart w:id="22" w:name="jason-roschmann"/>
+    <w:bookmarkStart w:id="23" w:name="jason-roschmann"/>
     <w:p>
       <w:pPr>
         <w:pStyle w:val="Heading1"/>
@@ -511,7 +511,7 @@
     </w:p>
     <w:bookmarkEnd w:id="17"/>
     <w:bookmarkEnd w:id="18"/>
-    <w:bookmarkStart w:id="19" w:name="weiterbildung-und-projektpraxis"/>
+    <w:bookmarkStart w:id="20" w:name="weiterbildung-und-projektpraxis"/>
     <w:p>
       <w:pPr>
         <w:pStyle w:val="Heading2"/>
@@ -541,8 +541,19 @@
         </w:numPr>
       </w:pPr>
       <w:r>
-        <w:t xml:space="preserve">Google Ads Skillshop, Januar 2026: Search, Performance Max</w:t>
-      </w:r>
+        <w:t xml:space="preserve">Google Ads Search Certification (Skillshop), Dezember 2025, gültig bis Dezember 2026 – verifizierbar:</w:t>
+      </w:r>
+      <w:r>
+        <w:t xml:space="preserve"> </w:t>
+      </w:r>
+      <w:hyperlink r:id="rId19">
+        <w:r>
+          <w:rPr>
+            <w:rStyle w:val="Hyperlink"/>
+          </w:rPr>
+          <w:t xml:space="preserve">https://www.credential.net/cd05c77a-a7ef-48e0-809e-5147135f810e</w:t>
+        </w:r>
+      </w:hyperlink>
     </w:p>
     <w:p>
       <w:pPr>
@@ -556,8 +567,8 @@
         <w:t xml:space="preserve">Laufende autodidaktische Weiterbildung anhand eigener und gemeinsamer Softwareprojekte</w:t>
       </w:r>
     </w:p>
-    <w:bookmarkEnd w:id="19"/>
-    <w:bookmarkStart w:id="20" w:name="kenntnisse-in-projekten-eingesetzt"/>
+    <w:bookmarkEnd w:id="20"/>
+    <w:bookmarkStart w:id="21" w:name="kenntnisse-in-projekten-eingesetzt"/>
     <w:p>
       <w:pPr>
         <w:pStyle w:val="Heading2"/>
@@ -638,8 +649,8 @@
         <w:t xml:space="preserve">Web &amp; Commerce: Shopify Liquid, Tailwind, GSAP, PWA, Canvas/WebGL</w:t>
       </w:r>
     </w:p>
-    <w:bookmarkEnd w:id="20"/>
-    <w:bookmarkStart w:id="21" w:name="sprachen"/>
+    <w:bookmarkEnd w:id="21"/>
+    <w:bookmarkStart w:id="22" w:name="sprachen"/>
     <w:p>
       <w:pPr>
         <w:pStyle w:val="Heading2"/>
@@ -660,8 +671,8 @@
         <w:t xml:space="preserve">Deutsch: Muttersprache · Englisch: B1, Richtung B2 · Polnisch: mündlich</w:t>
       </w:r>
     </w:p>
-    <w:bookmarkEnd w:id="21"/>
     <w:bookmarkEnd w:id="22"/>
+    <w:bookmarkEnd w:id="23"/>
     <w:sectPr>
       <w:footnotePr>
         <w:numRestart w:val="eachSect"/>

</xml_diff>

<commit_message>
feat(cv): Profilvariante E-Commerce & Online-Marketing, SEO-Belege im Entwickler-CV
- cv-print-marketing.html + ATS: Junior E-Commerce & Online-Marketing (technisches SEO,
  Shopify, Marketing-Automation); belegt aus duftkumpels-shop und flowki-club (Astra-Rangliste),
  ohne 119->8, GA4 2/2, TBT-Widerlegung und ohne Kundenumsatz
- Entwickler-CV DE/EN/ATS/Web: Zeile SEO & E-Mail (Search-Console-Auswertung, Klaviyo-Link)
- ATS-Zeilenabstand 1,3: alle sechs PDFs bleiben bei 2 Seiten
</commit_message>
<xml_diff>
--- a/ats-cv/Jason_Roschmann_CV_ATS.docx
+++ b/ats-cv/Jason_Roschmann_CV_ATS.docx
@@ -312,6 +312,18 @@
       </w:pPr>
       <w:r>
         <w:t xml:space="preserve">Shop &amp; Inhalte: gekauftes Shopify-Theme in Liquid, CSS und JavaScript umgebaut; eigene Design-Schicht im Live-Theme, dreisprachig (DE/EN/FR), Produktdaten über Metafields (duftkumpels.shop).</w:t>
+      </w:r>
+    </w:p>
+    <w:p>
+      <w:pPr>
+        <w:pStyle w:val="Compact"/>
+        <w:numPr>
+          <w:ilvl w:val="0"/>
+          <w:numId w:val="1004"/>
+        </w:numPr>
+      </w:pPr>
+      <w:r>
+        <w:t xml:space="preserve">SEO &amp; E-Mail: Search-Console-Auswertung der Suchfragen in DE/EN/FR automatisiert, Titel und Metadaten danach angepasst; Klaviyo-Abbruchmail auf einen wiederherstellbaren Checkout-Link korrigiert. (duftkumpels.shop)</w:t>
       </w:r>
     </w:p>
     <w:p>

</xml_diff>

<commit_message>
fix(cv,web): Astra-Review cb5574c - Hauptbuch nur fuer Erstbewerbungen, Atlas v2, Entwickler-CV ergaenzt
- Alle Fassungen: 'Hauptbuch aller Aussenaktionen' -> kanaluebergreifendes Hauptbuch fuer Erstbewerbungen
  (Antworten/Nachfassmails haben eigene Versandjournale)
- Atlas: Constraint-, Docker-, Izakaya-Datum und Rollout-Stand korrigiert; 'Rahmen' statt 'Grenze',
  Wirkungshinweis je Gruppe, Zeitraeume ergaenzt, Kernbelege je Filter, Spruenge zu Fallstudien 01-03
- Entwickler-CV DE/EN + ATS: Mehrsprachigkeits-Pipeline (GraphQL-Import) statt Performance-Zeile,
  700-URL-Indexpruefung in der SEO-Zeile
</commit_message>
<xml_diff>
--- a/ats-cv/Jason_Roschmann_CV_ATS.docx
+++ b/ats-cv/Jason_Roschmann_CV_ATS.docx
@@ -232,7 +232,7 @@
         </w:numPr>
       </w:pPr>
       <w:r>
-        <w:t xml:space="preserve">Gemeinsames Hauptbuch aller Außenaktionen mit Reservierung: keine Doppelbewerbung über Mail und Portal, höchstens eine Bewerbung je Firma in 14 Tagen.</w:t>
+        <w:t xml:space="preserve">Kanalübergreifendes Hauptbuch für Erstbewerbungen mit Reservierung: keine Doppelbewerbung über Mail und Portal, höchstens eine Bewerbung je Firma in 14 Tagen.</w:t>
       </w:r>
     </w:p>
     <w:p>
@@ -287,7 +287,7 @@
         <w:pStyle w:val="FirstParagraph"/>
       </w:pPr>
       <w:r>
-        <w:t xml:space="preserve">Websites und Shops für Kunden umgesetzt — von Gestaltung und Interaktion über Mehrsprachigkeit und rechtliche Vorgaben bis zu CI und Auslieferung.</w:t>
+        <w:t xml:space="preserve">Websites und Shops für Kunden — Gestaltung, Mehrsprachigkeit, rechtliche Vorgaben, CI und Auslieferung.</w:t>
       </w:r>
     </w:p>
     <w:p>
@@ -311,7 +311,7 @@
         </w:numPr>
       </w:pPr>
       <w:r>
-        <w:t xml:space="preserve">Shop &amp; Inhalte: gekauftes Shopify-Theme in Liquid, CSS und JavaScript umgebaut; eigene Design-Schicht im Live-Theme, dreisprachig (DE/EN/FR), Produktdaten über Metafields (duftkumpels.shop).</w:t>
+        <w:t xml:space="preserve">Shop &amp; Inhalte: gekauftes Shopify-Theme in Liquid, CSS und JavaScript umgebaut; eigene Design-Schicht im Live-Theme, Produktdaten über Metafields (duftkumpels.shop).</w:t>
       </w:r>
     </w:p>
     <w:p>
@@ -323,7 +323,7 @@
         </w:numPr>
       </w:pPr>
       <w:r>
-        <w:t xml:space="preserve">SEO &amp; E-Mail: Search-Console-Auswertung der Suchfragen in DE/EN/FR automatisiert, Titel und Metadaten danach angepasst; Klaviyo-Abbruchmail auf einen wiederherstellbaren Checkout-Link korrigiert. (duftkumpels.shop)</w:t>
+        <w:t xml:space="preserve">SEO &amp; E-Mail: Search-Console-Auswertung automatisiert, Titel und Metadaten angepasst; Indexierungsstatus von 700 URLs geprüft; Klaviyo-Abbruchmail auf wiederherstellbaren Checkout-Link korrigiert. (duftkumpels.shop)</w:t>
       </w:r>
     </w:p>
     <w:p>
@@ -347,7 +347,7 @@
         </w:numPr>
       </w:pPr>
       <w:r>
-        <w:t xml:space="preserve">Performance: versionierte Assets, Lade-Fallback, Performance-Runden gegen Ruckeln (nk247store.de).</w:t>
+        <w:t xml:space="preserve">Mehrsprachigkeit: Übersetzungs-Pipeline für DE/EN/FR mit HTML-Extraktion, Strukturprüfung und Import per CSV bzw. GraphQL; Produktnamen und Kollektionstexte lokalisiert (duftkumpels.shop).</w:t>
       </w:r>
     </w:p>
     <w:p>
@@ -566,18 +566,6 @@
           <w:t xml:space="preserve">https://www.credential.net/cd05c77a-a7ef-48e0-809e-5147135f810e</w:t>
         </w:r>
       </w:hyperlink>
-    </w:p>
-    <w:p>
-      <w:pPr>
-        <w:pStyle w:val="Compact"/>
-        <w:numPr>
-          <w:ilvl w:val="0"/>
-          <w:numId w:val="1008"/>
-        </w:numPr>
-      </w:pPr>
-      <w:r>
-        <w:t xml:space="preserve">Laufende autodidaktische Weiterbildung anhand eigener und gemeinsamer Softwareprojekte</w:t>
-      </w:r>
     </w:p>
     <w:bookmarkEnd w:id="20"/>
     <w:bookmarkStart w:id="21" w:name="kenntnisse-in-projekten-eingesetzt"/>

</xml_diff>

<commit_message>
fix(cv,web): Astra-Hinweise 6431419 - Publikationsrechte im Flowki-Bullet, KI-Agenten-Zeitraum, ATS-Umbruch
- Entwickler-CV DE/EN + ATS: Publikationsrechte vor dem Versand statt allgemeiner Job-Fixes
- Atlas: agentengestuetzte Entwicklung seit Juni, gezeigte Review-Praxis September 2026
- ATS-Stil: h2 und Einleitung nicht vom Inhalt trennen; DE-ATS dafuer gestrafft
- ATS DE/EN: Satzzeichen vor (duftkumpels.shop) korrigiert
</commit_message>
<xml_diff>
--- a/ats-cv/Jason_Roschmann_CV_ATS.docx
+++ b/ats-cv/Jason_Roschmann_CV_ATS.docx
@@ -132,7 +132,7 @@
         </w:numPr>
       </w:pPr>
       <w:r>
-        <w:t xml:space="preserve">Bis zu drei Schnittvarianten je Clip, höchstens eine je Zielkonto (Datenbank-Constraint); Fixes für hängende Jobs und eine doppelt ausgelöste Produktion.</w:t>
+        <w:t xml:space="preserve">Bis zu drei Schnittvarianten je Clip, höchstens eine je Zielkonto (Datenbank-Constraint); Publikationsrechte unmittelbar vor dem Versand erneut geprüft.</w:t>
       </w:r>
     </w:p>
     <w:p>
@@ -299,7 +299,7 @@
         </w:numPr>
       </w:pPr>
       <w:r>
-        <w:t xml:space="preserve">Frontend &amp; Interaktion: Next.js, React, TypeScript, GSAP — Hero als Frame-Sequenz, die sich mit dem Mauszeiger dreht (auf dem Handy per Geräteneigung); Vollbild-Kapitel mit eigener Mobile-Bedienung (nk247store.de).</w:t>
+        <w:t xml:space="preserve">Frontend &amp; Interaktion: Next.js, React, TypeScript, GSAP — Hero als Frame-Sequenz, die sich mit dem Mauszeiger dreht (mobil per Geräteneigung); Vollbild-Kapitel mit Mobile-Bedienung (nk247store.de).</w:t>
       </w:r>
     </w:p>
     <w:p>
@@ -323,7 +323,7 @@
         </w:numPr>
       </w:pPr>
       <w:r>
-        <w:t xml:space="preserve">SEO &amp; E-Mail: Search-Console-Auswertung automatisiert, Titel und Metadaten angepasst; Indexierungsstatus von 700 URLs geprüft; Klaviyo-Abbruchmail auf wiederherstellbaren Checkout-Link korrigiert. (duftkumpels.shop)</w:t>
+        <w:t xml:space="preserve">SEO &amp; E-Mail: Search-Console-Auswertung automatisiert, Titel und Metadaten angepasst; 700 URLs auf Indexierung geprüft; Klaviyo-Abbruchmail auf wiederherstellbaren Checkout-Link korrigiert (duftkumpels.shop).</w:t>
       </w:r>
     </w:p>
     <w:p>
@@ -429,7 +429,7 @@
         </w:numPr>
       </w:pPr>
       <w:r>
-        <w:t xml:space="preserve">Interaktives Web-CV — installierbare PWA ohne Framework: SVG-Displacement, Canvas-Graph, WebGL-Fluidsimulation (adaptiert von PavelDoGreat, MIT).</w:t>
+        <w:t xml:space="preserve">Interaktives Web-CV — installierbare PWA ohne Framework: SVG-Displacement, Canvas, WebGL-Fluidsimulation (adaptiert, MIT-Lizenz).</w:t>
       </w:r>
     </w:p>
     <w:bookmarkEnd w:id="15"/>
@@ -506,7 +506,7 @@
         </w:numPr>
       </w:pPr>
       <w:r>
-        <w:t xml:space="preserve">Kaltakquise und Bedarfsgespräche direkt mit Inhabern und Geschäftsführern, Verhandlung und Abschluss vor Ort.</w:t>
+        <w:t xml:space="preserve">Kaltakquise und Bedarfsgespräche mit Inhabern und Geschäftsführern, Verhandlung und Abschluss vor Ort.</w:t>
       </w:r>
     </w:p>
     <w:p>

</xml_diff>

<commit_message>
fix(cv,web): Sprachpruefung (Astra) - Grossschreibung nach Doppelpunkt, Zeichensetzung, teamwork, Monatsabkuerzungen Aug./Sep.
Grundlage: Wiles et al. (Management Science 2025) - fehlerfreie Texte erhoehen Einstellungschancen.
og:title an neuen Titel angeglichen; mobile Titel Standort/Fluid wie Navigation. Alle 7 PDFs 2 Seiten,
ATS-Extraktion (pdftotext -layout wie OpenCATS): Umlaute ok, 0 Ligaturen, 0 Ersatzzeichen, Links am Stueck.
Web-CV 390 px: 24 Datumsangaben ohne Umbruch, kein Overflow, 0 Konsolenfehler.
</commit_message>
<xml_diff>
--- a/ats-cv/Jason_Roschmann_CV_ATS.docx
+++ b/ats-cv/Jason_Roschmann_CV_ATS.docx
@@ -82,13 +82,13 @@
         <w:t xml:space="preserve">Projekte</w:t>
       </w:r>
     </w:p>
-    <w:bookmarkStart w:id="10" w:name="X3d112ea5102cbe085494ca9d164bd3b070dd4e1"/>
+    <w:bookmarkStart w:id="10" w:name="X1308fe9f499194d3aaffcfef0c16985e41b3b2d"/>
     <w:p>
       <w:pPr>
         <w:pStyle w:val="Heading3"/>
       </w:pPr>
       <w:r>
-        <w:t xml:space="preserve">Flowki Studio — Clip-Studio (Teamprojekt, Aug–Sep 2026)</w:t>
+        <w:t xml:space="preserve">Flowki Studio — Clip-Studio (Teamprojekt, Aug.–Sep. 2026)</w:t>
       </w:r>
     </w:p>
     <w:p>
@@ -148,13 +148,13 @@
       </w:r>
     </w:p>
     <w:bookmarkEnd w:id="10"/>
-    <w:bookmarkStart w:id="11" w:name="Xa50e32cda60364fcaeabd82b96288ade70c29fe"/>
+    <w:bookmarkStart w:id="11" w:name="X8f092b182176291c8102c1a9eeae6b3fc78035d"/>
     <w:p>
       <w:pPr>
         <w:pStyle w:val="Heading3"/>
       </w:pPr>
       <w:r>
-        <w:t xml:space="preserve">Fallbeispiel Fehlersuche — hermes-studio (Beitrag zu fremdem Projekt, Sep 2026)</w:t>
+        <w:t xml:space="preserve">Fallbeispiel Fehlersuche — hermes-studio (Beitrag zu fremdem Projekt, Sep. 2026)</w:t>
       </w:r>
     </w:p>
     <w:p>
@@ -417,7 +417,7 @@
         </w:numPr>
       </w:pPr>
       <w:r>
-        <w:t xml:space="preserve">Shinobi: Ember Accord — mobiles Idle-RPG (React Native, Skia, Supabase, pgTAP). Agenten-orchestriert: ein KI-Agent arbeitet im Lead-Modus 50 Rollen ab, die Produktentscheidungen treffe ich.</w:t>
+        <w:t xml:space="preserve">Shinobi: Ember Accord — mobiles Idle-RPG (React Native, Skia, Supabase, pgTAP). Agenten-orchestriert: Ein KI-Agent arbeitet im Lead-Modus 50 Rollen ab, die Produktentscheidungen treffe ich.</w:t>
       </w:r>
     </w:p>
     <w:p>

</xml_diff>

<commit_message>
feat(cv): Entwickler-CV DE v4 - Flowki Studio als Produkt, FlowKI Club als Mitgruender, hermes-studio auf Seite 1
Pruefskript nutzt pdftotext -layout wie in der Spezifikation und prueft Station + Zeitraum als Paar.
</commit_message>
<xml_diff>
--- a/ats-cv/Jason_Roschmann_CV_ATS.docx
+++ b/ats-cv/Jason_Roschmann_CV_ATS.docx
@@ -2,7 +2,7 @@
 <file path=word/document.xml><?xml version="1.0" encoding="utf-8"?>
 <w:document xmlns:w="http://schemas.openxmlformats.org/wordprocessingml/2006/main" xmlns:m="http://schemas.openxmlformats.org/officeDocument/2006/math" xmlns:r="http://schemas.openxmlformats.org/officeDocument/2006/relationships" xmlns:o="urn:schemas-microsoft-com:office:office" xmlns:v="urn:schemas-microsoft-com:vml" xmlns:w10="urn:schemas-microsoft-com:office:word" xmlns:a="http://schemas.openxmlformats.org/drawingml/2006/main" xmlns:pic="http://schemas.openxmlformats.org/drawingml/2006/picture" xmlns:wp="http://schemas.openxmlformats.org/drawingml/2006/wordprocessingDrawing">
   <w:body>
-    <w:bookmarkStart w:id="23" w:name="jason-roschmann"/>
+    <w:bookmarkStart w:id="22" w:name="jason-roschmann"/>
     <w:p>
       <w:pPr>
         <w:pStyle w:val="Heading1"/>
@@ -16,7 +16,7 @@
         <w:pStyle w:val="FirstParagraph"/>
       </w:pPr>
       <w:r>
-        <w:t xml:space="preserve">Junior Softwareentwickler / Software Engineer · KI-Automation</w:t>
+        <w:t xml:space="preserve">Junior Softwareentwickler / Software Engineer · Python · TypeScript · KI-Automation</w:t>
       </w:r>
     </w:p>
     <w:p>
@@ -24,7 +24,36 @@
         <w:pStyle w:val="BodyText"/>
       </w:pPr>
       <w:r>
-        <w:t xml:space="preserve">Ich entwickle KI-Automationen – und mache ihr Verhalten überprüfbar.</w:t>
+        <w:t xml:space="preserve">E-Mail: jason@roschmann-digital.de | Telefon: +49 155 612 953 91</w:t>
+      </w:r>
+      <w:r>
+        <w:br/>
+      </w:r>
+      <w:r>
+        <w:t xml:space="preserve">LinkedIn: linkedin.com/in/jason-roschmann-1091512b2 | GitHub: github.com/JasonRoschmann | Web-CV: jasonroschmann.github.io/cv</w:t>
+      </w:r>
+      <w:r>
+        <w:br/>
+      </w:r>
+      <w:r>
+        <w:t xml:space="preserve">Wohnort: Hamburg, Deutschland | Gesucht: Hamburg oder remote; Umzug nach Zürich für eine passende Rolle möglich | Start nach Absprache</w:t>
+      </w:r>
+    </w:p>
+    <w:bookmarkStart w:id="9" w:name="profil"/>
+    <w:p>
+      <w:pPr>
+        <w:pStyle w:val="Heading2"/>
+      </w:pPr>
+      <w:r>
+        <w:t xml:space="preserve">Profil</w:t>
+      </w:r>
+    </w:p>
+    <w:p>
+      <w:pPr>
+        <w:pStyle w:val="FirstParagraph"/>
+      </w:pPr>
+      <w:r>
+        <w:t xml:space="preserve">Ich entwickle Weboberflächen und Python-Abläufe für konkrete Arbeitsprozesse: Content-Produktion, E-Commerce und Community-Werkzeuge. Meine Schwerpunkte sind die Verbindung von Oberfläche und Backend, nachvollziehbare Zustände und gezielte Fehlerprüfungen – mit KI-Agenten als Werkzeug und eigener Verantwortung für Anforderungen und Abnahme. Aus vier Jahren Vertrieb bringe ich Erfahrung darin mit, Anforderungen im direkten Gespräch zu verstehen.</w:t>
       </w:r>
     </w:p>
     <w:p>
@@ -32,36 +61,26 @@
         <w:pStyle w:val="BodyText"/>
       </w:pPr>
       <w:r>
-        <w:t xml:space="preserve">E-Mail: jason@roschmann-digital.de | Telefon: +49 155 612 953 91</w:t>
-      </w:r>
-      <w:r>
-        <w:br/>
-      </w:r>
-      <w:r>
-        <w:t xml:space="preserve">LinkedIn: linkedin.com/in/jason-roschmann-1091512b2 | GitHub: github.com/JasonRoschmann | Web-CV: jasonroschmann.github.io/cv</w:t>
-      </w:r>
-      <w:r>
-        <w:br/>
-      </w:r>
-      <w:r>
-        <w:t xml:space="preserve">Wohnort: Hamburg, Deutschland | Gesucht: Hamburg oder remote; Umzug nach Zürich für eine passende Rolle möglich | Start nach Absprache</w:t>
-      </w:r>
-    </w:p>
-    <w:p>
-      <w:pPr>
-        <w:pStyle w:val="BodyText"/>
-      </w:pPr>
-      <w:r>
-        <w:t xml:space="preserve">Kernstack: Python, FastAPI, TypeScript, React/Next.js, PostgreSQL, Docker</w:t>
-      </w:r>
-    </w:p>
-    <w:bookmarkStart w:id="9" w:name="profil"/>
+        <w:t xml:space="preserve">Kennzahlen: 50 eigene Pull Requests gemergt (Flowki Studio, Teamprojekt) · 21 → 0 rote Tests, zwei Ursachen behoben (hermes-studio) · rund 66 Discord-Mitglieder FlowKI Club (Stand 29.09.2026) · 4 Jahre B2B-Vertrieb mit täglichem Kundenkontakt (2019–2023)</w:t>
+      </w:r>
+    </w:p>
+    <w:bookmarkEnd w:id="9"/>
+    <w:bookmarkStart w:id="15" w:name="projekte"/>
     <w:p>
       <w:pPr>
         <w:pStyle w:val="Heading2"/>
       </w:pPr>
       <w:r>
-        <w:t xml:space="preserve">Profil</w:t>
+        <w:t xml:space="preserve">Projekte</w:t>
+      </w:r>
+    </w:p>
+    <w:bookmarkStart w:id="10" w:name="X40522d7e3ff69a9e05b72646dc5fd212320d02c"/>
+    <w:p>
+      <w:pPr>
+        <w:pStyle w:val="Heading3"/>
+      </w:pPr>
+      <w:r>
+        <w:t xml:space="preserve">Flowki Studio — internes Social-Media-Studio, Teamprojekt (Aug. 2026 – heute)</w:t>
       </w:r>
     </w:p>
     <w:p>
@@ -69,26 +88,97 @@
         <w:pStyle w:val="FirstParagraph"/>
       </w:pPr>
       <w:r>
-        <w:t xml:space="preserve">Ich entwickle KI-Automationen und Webanwendungen mit Python und TypeScript, eigenständig und im Team. Meine Praxis umfasst API-Integration, Hintergrundjobs und gezielte Tests gegen doppelte Aktionen und Datenverlust. KI-Agenten nutze ich für die Umsetzung; Anforderungen und Abnahme meiner Beiträge verantworte ich selbst. Ich suche eine Junior-Rolle in KI-Automation oder Backend-/Fullstack-Entwicklung.</w:t>
-      </w:r>
-    </w:p>
-    <w:bookmarkEnd w:id="9"/>
-    <w:bookmarkStart w:id="13" w:name="projekte"/>
-    <w:p>
-      <w:pPr>
-        <w:pStyle w:val="Heading2"/>
-      </w:pPr>
-      <w:r>
-        <w:t xml:space="preserve">Projekte</w:t>
-      </w:r>
-    </w:p>
-    <w:bookmarkStart w:id="10" w:name="X1308fe9f499194d3aaffcfef0c16985e41b3b2d"/>
+        <w:t xml:space="preserve">Zweck: Internes Social-Media-Studio für Themenrecherche, KI-gestützte Content-Produktion, redaktionelle Prüfung und Plattformübergabe; mein Beitrag im Team: Produktoberflächen, Workflow-Integration, Clip-Verarbeitung und Publishing.</w:t>
+      </w:r>
+    </w:p>
+    <w:p>
+      <w:pPr>
+        <w:pStyle w:val="Compact"/>
+        <w:numPr>
+          <w:ilvl w:val="0"/>
+          <w:numId w:val="1001"/>
+        </w:numPr>
+      </w:pPr>
+      <w:r>
+        <w:t xml:space="preserve">Produktoberfläche: Produktions-, Freigabe- und Veröffentlichungsansichten weiterentwickelt – Bearbeitungsstände, Phasendauer und erforderliche Nutzeraktionen sichtbar gemacht.</w:t>
+      </w:r>
+    </w:p>
+    <w:p>
+      <w:pPr>
+        <w:pStyle w:val="Compact"/>
+        <w:numPr>
+          <w:ilvl w:val="0"/>
+          <w:numId w:val="1001"/>
+        </w:numPr>
+      </w:pPr>
+      <w:r>
+        <w:t xml:space="preserve">Redaktionelle Zusammenarbeit: Ablehnungsgründe durch Oberfläche, API-Client und Freigabeprotokoll verbunden – Rückgaben zur Überarbeitung mit nachvollziehbarer Begründung ermöglicht.</w:t>
+      </w:r>
+    </w:p>
+    <w:p>
+      <w:pPr>
+        <w:pStyle w:val="Compact"/>
+        <w:numPr>
+          <w:ilvl w:val="0"/>
+          <w:numId w:val="1001"/>
+        </w:numPr>
+      </w:pPr>
+      <w:r>
+        <w:t xml:space="preserve">Fehlerbehandlung: Erfolgreiche Produktion bzw. Lizenzierung von nachfolgenden Status- und Zuordnungsfehlern getrennt – irreführende Fehlermeldungen und Anreize für erneute, kostenwirksame Aufrufe beseitigt.</w:t>
+      </w:r>
+    </w:p>
+    <w:p>
+      <w:pPr>
+        <w:pStyle w:val="Compact"/>
+        <w:numPr>
+          <w:ilvl w:val="0"/>
+          <w:numId w:val="1001"/>
+        </w:numPr>
+      </w:pPr>
+      <w:r>
+        <w:t xml:space="preserve">Videoverarbeitung: Speaker-Reframe, Schnittvarianten und reproduzierbaren Neu-Render nach Korrekturen umgesetzt – Langvideos in bearbeitbare Hochformat-Clips überführt.</w:t>
+      </w:r>
+    </w:p>
+    <w:p>
+      <w:pPr>
+        <w:pStyle w:val="Compact"/>
+        <w:numPr>
+          <w:ilvl w:val="0"/>
+          <w:numId w:val="1001"/>
+        </w:numPr>
+      </w:pPr>
+      <w:r>
+        <w:t xml:space="preserve">Publishing: TikTok-Entwurfsweg mit eigenem Status und Nutzerhinweis integriert – hochgeladene Entwürfe eindeutig von veröffentlichten Posts unterschieden.</w:t>
+      </w:r>
+    </w:p>
+    <w:p>
+      <w:pPr>
+        <w:pStyle w:val="Compact"/>
+        <w:numPr>
+          <w:ilvl w:val="0"/>
+          <w:numId w:val="1001"/>
+        </w:numPr>
+      </w:pPr>
+      <w:r>
+        <w:t xml:space="preserve">Qualitätssicherung: Fehlerfälle zuerst reproduziert und durch gezielte Gegenproben abgesichert.</w:t>
+      </w:r>
+    </w:p>
+    <w:p>
+      <w:pPr>
+        <w:pStyle w:val="FirstParagraph"/>
+      </w:pPr>
+      <w:r>
+        <w:t xml:space="preserve">Tools: Python, FastAPI, Celery, SQLAlchemy/Alembic, PostgreSQL, Redis, Next.js, TypeScript</w:t>
+      </w:r>
+    </w:p>
+    <w:bookmarkEnd w:id="10"/>
+    <w:bookmarkStart w:id="11" w:name="Xd98e50ae36e698c344452810c327f7751f8260b"/>
     <w:p>
       <w:pPr>
         <w:pStyle w:val="Heading3"/>
       </w:pPr>
       <w:r>
-        <w:t xml:space="preserve">Flowki Studio — Clip-Studio (Teamprojekt, Aug.–Sep. 2026)</w:t>
+        <w:t xml:space="preserve">FlowKI Club — Mitgründer, Website, Discord-Bot, Newsletter (Apr. 2026 – heute)</w:t>
       </w:r>
     </w:p>
     <w:p>
@@ -96,123 +186,167 @@
         <w:pStyle w:val="FirstParagraph"/>
       </w:pPr>
       <w:r>
-        <w:t xml:space="preserve">Zweck: Internes Social-Media-Studio mit Trends, Plattform-Playbooks und KI-Content-Pipeline. Das Clip-Studio macht aus Langvideos Shorts — mein Schwerpunkt. 64 Pull Requests in Flowki Studio, davon 50 gemergt.</w:t>
-      </w:r>
-    </w:p>
-    <w:p>
-      <w:pPr>
-        <w:pStyle w:val="Compact"/>
-        <w:numPr>
-          <w:ilvl w:val="0"/>
-          <w:numId w:val="1001"/>
-        </w:numPr>
-      </w:pPr>
-      <w:r>
-        <w:t xml:space="preserve">Speaker-Reframe: Gesichtsposition an mehreren Zeitpunkten gemessen statt einmal, geglättet zu stückweise konstanten 9:16-Keyframes — der Ausschnitt folgt der sprechenden Person.</w:t>
-      </w:r>
-    </w:p>
-    <w:p>
-      <w:pPr>
-        <w:pStyle w:val="Compact"/>
-        <w:numPr>
-          <w:ilvl w:val="0"/>
-          <w:numId w:val="1001"/>
-        </w:numPr>
-      </w:pPr>
-      <w:r>
-        <w:t xml:space="preserve">Deterministischer Neu-Render nach Korrekturen: append-only Planversionen, jede Planänderung entwertet eine erteilte Freigabe; Render asynchron über Celery, ohne Modellkosten.</w:t>
-      </w:r>
-    </w:p>
-    <w:p>
-      <w:pPr>
-        <w:pStyle w:val="Compact"/>
-        <w:numPr>
-          <w:ilvl w:val="0"/>
-          <w:numId w:val="1001"/>
-        </w:numPr>
-      </w:pPr>
-      <w:r>
-        <w:t xml:space="preserve">Bis zu drei Schnittvarianten je Clip, höchstens eine je Zielkonto (Datenbank-Constraint); Publikationsrechte unmittelbar vor dem Versand erneut geprüft.</w:t>
-      </w:r>
-    </w:p>
-    <w:p>
-      <w:pPr>
-        <w:pStyle w:val="Compact"/>
-        <w:numPr>
-          <w:ilvl w:val="0"/>
-          <w:numId w:val="1001"/>
-        </w:numPr>
-      </w:pPr>
-      <w:r>
-        <w:t xml:space="preserve">Stack: Python, FastAPI, Celery, SQLAlchemy/Alembic, PostgreSQL, Redis, MinIO, Next.js</w:t>
-      </w:r>
-    </w:p>
-    <w:bookmarkEnd w:id="10"/>
-    <w:bookmarkStart w:id="11" w:name="X8f092b182176291c8102c1a9eeae6b3fc78035d"/>
+        <w:t xml:space="preserve">Zweck: Deutschsprachige KI-Community – rund 66 Mitglieder im Discord (Stand 29.09.2026) – mit Fachartikeln, Online-Calls und gemeinsamer Projektarbeit; ich verbinde Community-Arbeit mit technischer Produktentwicklung.</w:t>
+      </w:r>
+    </w:p>
+    <w:p>
+      <w:pPr>
+        <w:pStyle w:val="Compact"/>
+        <w:numPr>
+          <w:ilvl w:val="0"/>
+          <w:numId w:val="1002"/>
+        </w:numPr>
+      </w:pPr>
+      <w:r>
+        <w:t xml:space="preserve">Community-Werkzeuge: Discord-Bot um /ask und Self-Service-Themenrollen erweitert; Discord.js und Testwerkzeuge aktualisiert.</w:t>
+      </w:r>
+    </w:p>
+    <w:p>
+      <w:pPr>
+        <w:pStyle w:val="Compact"/>
+        <w:numPr>
+          <w:ilvl w:val="0"/>
+          <w:numId w:val="1002"/>
+        </w:numPr>
+      </w:pPr>
+      <w:r>
+        <w:t xml:space="preserve">KI-Antwortqualität: Artikelinhalte als Wissensgrundlage des FAQ-Bots angebunden und einen Relevanz-Prüfschritt ergänzt – Verhalten bei unpassenden Treffern mit gezielten Tests abgesichert.</w:t>
+      </w:r>
+    </w:p>
+    <w:p>
+      <w:pPr>
+        <w:pStyle w:val="Compact"/>
+        <w:numPr>
+          <w:ilvl w:val="0"/>
+          <w:numId w:val="1002"/>
+        </w:numPr>
+      </w:pPr>
+      <w:r>
+        <w:t xml:space="preserve">Website &amp; Newsletter: Newsletter mit Double-Opt-In und Empfehlungslinks, Plausible-Ereignisse für Anmeldung und Klicks auf Discord-Beitrittslinks; Autoren-, FAQ- und HowTo-Markup in der Artikelausgabe.</w:t>
+      </w:r>
+    </w:p>
+    <w:p>
+      <w:pPr>
+        <w:pStyle w:val="Compact"/>
+        <w:numPr>
+          <w:ilvl w:val="0"/>
+          <w:numId w:val="1002"/>
+        </w:numPr>
+      </w:pPr>
+      <w:r>
+        <w:t xml:space="preserve">Community: Mitglieder beim Einstieg begleitet, Online-Calls organisiert und moderiert, bei ihren Projekten unterstützt.</w:t>
+      </w:r>
+    </w:p>
+    <w:p>
+      <w:pPr>
+        <w:pStyle w:val="FirstParagraph"/>
+      </w:pPr>
+      <w:r>
+        <w:t xml:space="preserve">Tools: TypeScript, discord.js, Claude-API, PostgreSQL, Vitest, Next.js</w:t>
+      </w:r>
+    </w:p>
+    <w:bookmarkEnd w:id="11"/>
+    <w:bookmarkStart w:id="12" w:name="X5c28e3663588d156f962f0df303720ee67b6052"/>
     <w:p>
       <w:pPr>
         <w:pStyle w:val="Heading3"/>
       </w:pPr>
       <w:r>
-        <w:t xml:space="preserve">Fallbeispiel Fehlersuche — hermes-studio (Beitrag zu fremdem Projekt, Sep. 2026)</w:t>
-      </w:r>
-    </w:p>
-    <w:p>
-      <w:pPr>
-        <w:pStyle w:val="Compact"/>
-        <w:numPr>
-          <w:ilvl w:val="0"/>
-          <w:numId w:val="1002"/>
-        </w:numPr>
-      </w:pPr>
-      <w:r>
-        <w:t xml:space="preserve">Ursache: 21 rote Tests, zwei Ursachen — 20× ein nie geschlossenes SQLite-Handle, das unter Windows das Aufräumen sperrt; 1× ein veralteter Test gegen eine Sicherheitsregel.</w:t>
-      </w:r>
-    </w:p>
-    <w:p>
-      <w:pPr>
-        <w:pStyle w:val="Compact"/>
-        <w:numPr>
-          <w:ilvl w:val="0"/>
-          <w:numId w:val="1002"/>
-        </w:numPr>
-      </w:pPr>
-      <w:r>
-        <w:t xml:space="preserve">Korrektur: Handle geschlossen, Sicherheitsregel behalten, Test korrigiert. Zusätzlich, als eigener Beitrag: stillen Datenverlust im Task-Store behoben, mit fünf neuen Tests.</w:t>
-      </w:r>
-    </w:p>
-    <w:p>
-      <w:pPr>
-        <w:pStyle w:val="Compact"/>
-        <w:numPr>
-          <w:ilvl w:val="0"/>
-          <w:numId w:val="1002"/>
-        </w:numPr>
-      </w:pPr>
-      <w:r>
-        <w:t xml:space="preserve">Nachweis: Mutationsprobe — eine gezielte Abschwächung der Sicherheitsregel ließ den korrigierten Test scheitern. Test-Suite von 177 auf 199 grüne Tests.</w:t>
-      </w:r>
-    </w:p>
-    <w:p>
-      <w:pPr>
-        <w:pStyle w:val="Compact"/>
-        <w:numPr>
-          <w:ilvl w:val="0"/>
-          <w:numId w:val="1002"/>
-        </w:numPr>
-      </w:pPr>
-      <w:r>
-        <w:t xml:space="preserve">So arbeite ich mit KI-Agenten: Fehler zuerst als roter Test, Agent setzt um, ein zweites Modell prüft zusätzlich als Reviewer, Rollout mit Prüfsummen und automatischem Rückbau.</w:t>
-      </w:r>
-    </w:p>
-    <w:bookmarkEnd w:id="11"/>
-    <w:bookmarkStart w:id="12" w:name="X4094cd3786f83d91073481ac877848284bc6906"/>
+        <w:t xml:space="preserve">hermes-studio — Beitrag zu fremdem Projekt, Fehleranalyse (Sep. 2026)</w:t>
+      </w:r>
+    </w:p>
+    <w:p>
+      <w:pPr>
+        <w:pStyle w:val="Compact"/>
+        <w:numPr>
+          <w:ilvl w:val="0"/>
+          <w:numId w:val="1003"/>
+        </w:numPr>
+      </w:pPr>
+      <w:r>
+        <w:t xml:space="preserve">Ursache: 21 rote Tests mit zwei Ursachen – 20× ein nie geschlossenes SQLite-Handle, das unter Windows das Aufräumen sperrt, 1× ein veralteter Test gegen eine Sicherheitsregel; Handle geschlossen, Regel behalten, Test korrigiert.</w:t>
+      </w:r>
+    </w:p>
+    <w:p>
+      <w:pPr>
+        <w:pStyle w:val="Compact"/>
+        <w:numPr>
+          <w:ilvl w:val="0"/>
+          <w:numId w:val="1003"/>
+        </w:numPr>
+      </w:pPr>
+      <w:r>
+        <w:t xml:space="preserve">Nachweis: Mutationsprobe – mit abgeschwächter Sicherheitsregel scheitert der korrigierte Test; bestandene Tests: 177/198 → 199/199.</w:t>
+      </w:r>
+    </w:p>
+    <w:p>
+      <w:pPr>
+        <w:pStyle w:val="Compact"/>
+        <w:numPr>
+          <w:ilvl w:val="0"/>
+          <w:numId w:val="1003"/>
+        </w:numPr>
+      </w:pPr>
+      <w:r>
+        <w:t xml:space="preserve">Eigener Beitrag: Stillen Datenverlust im Task-Store behoben, mit fünf neuen Tests.</w:t>
+      </w:r>
+    </w:p>
+    <w:bookmarkEnd w:id="12"/>
+    <w:bookmarkStart w:id="13" w:name="X588b0a18a79db9064ad2be76a698cef3d3cf720"/>
     <w:p>
       <w:pPr>
         <w:pStyle w:val="Heading3"/>
       </w:pPr>
       <w:r>
-        <w:t xml:space="preserve">KI-gestützte Bewerbungsverwaltung (Eigenprojekt, seit Juli 2026)</w:t>
+        <w:t xml:space="preserve">duftkumpels.shop — Kundenprojekt, Shopify, API- &amp; Übersetzungsautomatisierung (Juni 2026 – heute)</w:t>
+      </w:r>
+    </w:p>
+    <w:p>
+      <w:pPr>
+        <w:pStyle w:val="Compact"/>
+        <w:numPr>
+          <w:ilvl w:val="0"/>
+          <w:numId w:val="1004"/>
+        </w:numPr>
+      </w:pPr>
+      <w:r>
+        <w:t xml:space="preserve">Automatisierung: Übersetzungs-Pipeline DE/EN/FR mit HTML-Extraktion, Strukturprüfung und Import per CSV bzw. GraphQL; Verfügbarkeitsabgleich über die Admin-GraphQL-API mit Sicherung und Rücklesen.</w:t>
+      </w:r>
+    </w:p>
+    <w:p>
+      <w:pPr>
+        <w:pStyle w:val="Compact"/>
+        <w:numPr>
+          <w:ilvl w:val="0"/>
+          <w:numId w:val="1004"/>
+        </w:numPr>
+      </w:pPr>
+      <w:r>
+        <w:t xml:space="preserve">SEO-Technik: Search-Console-Auswertung automatisiert, 700 URLs auf Indexierung geprüft; JSON-LD ergänzt und automatisiert geprüft.</w:t>
+      </w:r>
+    </w:p>
+    <w:p>
+      <w:pPr>
+        <w:pStyle w:val="Compact"/>
+        <w:numPr>
+          <w:ilvl w:val="0"/>
+          <w:numId w:val="1004"/>
+        </w:numPr>
+      </w:pPr>
+      <w:r>
+        <w:t xml:space="preserve">Theme &amp; Qualität: Gekauftes Theme in Liquid, CSS und JavaScript umgebaut; wöchentliche Lighthouse-Prüfung gegen den Live-Shop per GitHub Actions.</w:t>
+      </w:r>
+    </w:p>
+    <w:p>
+      <w:pPr>
+        <w:pStyle w:val="Compact"/>
+        <w:numPr>
+          <w:ilvl w:val="0"/>
+          <w:numId w:val="1004"/>
+        </w:numPr>
+      </w:pPr>
+      <w:r>
+        <w:t xml:space="preserve">E-Mail: Klaviyo-Abbruchmail auf wiederherstellbaren Checkout-Link korrigiert.</w:t>
       </w:r>
     </w:p>
     <w:p>
@@ -220,66 +354,17 @@
         <w:pStyle w:val="FirstParagraph"/>
       </w:pPr>
       <w:r>
-        <w:t xml:space="preserve">Zweck: Python-Pipeline für Stellensuche über Job-APIs (u. a. Bundesagentur für Arbeit, Greenhouse, Lever), Anschreiben, Prüfungen, Versand und Antwortzuordnung. Schwerpunkt: nachvollziehbare Aktionen. 94 Python-Dateien, davon 56 Testdateien.</w:t>
-      </w:r>
-    </w:p>
-    <w:p>
-      <w:pPr>
-        <w:pStyle w:val="Compact"/>
-        <w:numPr>
-          <w:ilvl w:val="0"/>
-          <w:numId w:val="1003"/>
-        </w:numPr>
-      </w:pPr>
-      <w:r>
-        <w:t xml:space="preserve">Kanalübergreifendes Hauptbuch für Erstbewerbungen mit Reservierung: keine Doppelbewerbung über Mail und Portal, höchstens eine Bewerbung je Firma in 14 Tagen.</w:t>
-      </w:r>
-    </w:p>
-    <w:p>
-      <w:pPr>
-        <w:pStyle w:val="Compact"/>
-        <w:numPr>
-          <w:ilvl w:val="0"/>
-          <w:numId w:val="1003"/>
-        </w:numPr>
-      </w:pPr>
-      <w:r>
-        <w:t xml:space="preserve">Blockierende Prüfungen vor dem Versand: unbrauchbare Modellantworten stoppen den Lauf; Modell-Kaskade (Claude, Gemini, Groq) mit Sperrzeiten.</w:t>
-      </w:r>
-    </w:p>
-    <w:p>
-      <w:pPr>
-        <w:pStyle w:val="Compact"/>
-        <w:numPr>
-          <w:ilvl w:val="0"/>
-          <w:numId w:val="1003"/>
-        </w:numPr>
-      </w:pPr>
-      <w:r>
-        <w:t xml:space="preserve">LLM-Bewertungen gegen blinde Referenzurteile geprüft; eine überarbeitete Analyse nach unvollständiger Messung ohne belegte Verbesserung nicht ausgerollt.</w:t>
-      </w:r>
-    </w:p>
-    <w:p>
-      <w:pPr>
-        <w:pStyle w:val="Compact"/>
-        <w:numPr>
-          <w:ilvl w:val="0"/>
-          <w:numId w:val="1003"/>
-        </w:numPr>
-      </w:pPr>
-      <w:r>
-        <w:t xml:space="preserve">Rollouts mit Prüfsummen, Tests vor und nach dem Tausch und automatischem Rückbau.</w:t>
-      </w:r>
-    </w:p>
-    <w:bookmarkEnd w:id="12"/>
+        <w:t xml:space="preserve">Tools: Shopify Liquid, Admin-GraphQL-API, Python, GitHub Actions, Klaviyo</w:t>
+      </w:r>
+    </w:p>
     <w:bookmarkEnd w:id="13"/>
-    <w:bookmarkStart w:id="14" w:name="web--shop-entwicklung-für-kunden"/>
-    <w:p>
-      <w:pPr>
-        <w:pStyle w:val="Heading2"/>
-      </w:pPr>
-      <w:r>
-        <w:t xml:space="preserve">Web- &amp; Shop-Entwicklung für Kunden</w:t>
+    <w:bookmarkStart w:id="14" w:name="X27dd574a98008e548c9b2d0e8137d7142d40707"/>
+    <w:p>
+      <w:pPr>
+        <w:pStyle w:val="Heading3"/>
+      </w:pPr>
+      <w:r>
+        <w:t xml:space="preserve">KI-gestützte Bewerbungsverwaltung — Eigenprojekt, Python (Juli 2026 – heute)</w:t>
       </w:r>
     </w:p>
     <w:p>
@@ -287,151 +372,58 @@
         <w:pStyle w:val="FirstParagraph"/>
       </w:pPr>
       <w:r>
-        <w:t xml:space="preserve">Websites und Shops für Kunden — Gestaltung, Mehrsprachigkeit, rechtliche Vorgaben, CI und Auslieferung.</w:t>
-      </w:r>
-    </w:p>
-    <w:p>
-      <w:pPr>
-        <w:pStyle w:val="Compact"/>
-        <w:numPr>
-          <w:ilvl w:val="0"/>
-          <w:numId w:val="1004"/>
-        </w:numPr>
-      </w:pPr>
-      <w:r>
-        <w:t xml:space="preserve">Frontend &amp; Interaktion: Next.js, React, TypeScript, GSAP — Hero als Frame-Sequenz, die sich mit dem Mauszeiger dreht (mobil per Geräteneigung); Vollbild-Kapitel mit Mobile-Bedienung (nk247store.de).</w:t>
-      </w:r>
-    </w:p>
-    <w:p>
-      <w:pPr>
-        <w:pStyle w:val="Compact"/>
-        <w:numPr>
-          <w:ilvl w:val="0"/>
-          <w:numId w:val="1004"/>
-        </w:numPr>
-      </w:pPr>
-      <w:r>
-        <w:t xml:space="preserve">Shop &amp; Inhalte: gekauftes Shopify-Theme in Liquid, CSS und JavaScript umgebaut; eigene Design-Schicht im Live-Theme, Produktdaten über Metafields (duftkumpels.shop).</w:t>
-      </w:r>
-    </w:p>
-    <w:p>
-      <w:pPr>
-        <w:pStyle w:val="Compact"/>
-        <w:numPr>
-          <w:ilvl w:val="0"/>
-          <w:numId w:val="1004"/>
-        </w:numPr>
-      </w:pPr>
-      <w:r>
-        <w:t xml:space="preserve">SEO &amp; E-Mail: Search-Console-Auswertung automatisiert, Titel und Metadaten angepasst; 700 URLs auf Indexierung geprüft; Klaviyo-Abbruchmail auf wiederherstellbaren Checkout-Link korrigiert (duftkumpels.shop).</w:t>
-      </w:r>
-    </w:p>
-    <w:p>
-      <w:pPr>
-        <w:pStyle w:val="Compact"/>
-        <w:numPr>
-          <w:ilvl w:val="0"/>
-          <w:numId w:val="1004"/>
-        </w:numPr>
-      </w:pPr>
-      <w:r>
-        <w:t xml:space="preserve">Qualität &amp; Auslieferung: CI mit TypeScript-Check, ESLint, Vitest, Build und Playwright (nk247store.de); wöchentliche Lighthouse-Prüfung gegen den Live-Shop per GitHub Actions (duftkumpels.shop).</w:t>
-      </w:r>
-    </w:p>
-    <w:p>
-      <w:pPr>
-        <w:pStyle w:val="Compact"/>
-        <w:numPr>
-          <w:ilvl w:val="0"/>
-          <w:numId w:val="1004"/>
-        </w:numPr>
-      </w:pPr>
-      <w:r>
-        <w:t xml:space="preserve">Mehrsprachigkeit: Übersetzungs-Pipeline für DE/EN/FR mit HTML-Extraktion, Strukturprüfung und Import per CSV bzw. GraphQL; Produktnamen und Kollektionstexte lokalisiert (duftkumpels.shop).</w:t>
-      </w:r>
-    </w:p>
-    <w:p>
-      <w:pPr>
-        <w:pStyle w:val="Compact"/>
-        <w:numPr>
-          <w:ilvl w:val="0"/>
-          <w:numId w:val="1004"/>
-        </w:numPr>
-      </w:pPr>
-      <w:r>
-        <w:t xml:space="preserve">Recht &amp; Inhalte: Tabakwerbung nach § 19 TabakerzG aus allen Motiven entfernt (nk247store.de).</w:t>
-      </w:r>
-    </w:p>
-    <w:p>
-      <w:pPr>
-        <w:pStyle w:val="Compact"/>
-        <w:numPr>
-          <w:ilvl w:val="0"/>
-          <w:numId w:val="1004"/>
-        </w:numPr>
-      </w:pPr>
-      <w:r>
-        <w:t xml:space="preserve">KI-Werkzeuge: Design-Brief geschrieben, KI-Website-Builder gesteuert und selbst nachgearbeitet — Kamerafahrten aus echten Fotos, Farbkorrektur, Übergänge (Redesign-Entwurf für ein Hamburger Izakaya).</w:t>
-      </w:r>
-    </w:p>
-    <w:p>
-      <w:pPr>
-        <w:pStyle w:val="Compact"/>
-        <w:numPr>
-          <w:ilvl w:val="0"/>
-          <w:numId w:val="1004"/>
-        </w:numPr>
-      </w:pPr>
-      <w:r>
-        <w:t xml:space="preserve">Referenzen: duftkumpels.shop — Projektarbeit seit Juni 2026, Anpassungen im Live-Theme; nk247store.de — Kundenprojekt im Team, meine Überarbeitung noch nicht veröffentlicht.</w:t>
+        <w:t xml:space="preserve">Zweck: Python-Pipeline für Stellensuche über Job-APIs (u. a. Bundesagentur für Arbeit, Greenhouse, Lever), Anschreiben, Prüfungen, Versand und Antwortzuordnung.</w:t>
+      </w:r>
+    </w:p>
+    <w:p>
+      <w:pPr>
+        <w:pStyle w:val="Compact"/>
+        <w:numPr>
+          <w:ilvl w:val="0"/>
+          <w:numId w:val="1005"/>
+        </w:numPr>
+      </w:pPr>
+      <w:r>
+        <w:t xml:space="preserve">Nachvollziehbarkeit: Kanalübergreifendes Hauptbuch für Erstbewerbungen mit Reservierung – keine Doppelbewerbung über Mail und Portal, höchstens eine Bewerbung je Firma in 14 Tagen.</w:t>
+      </w:r>
+    </w:p>
+    <w:p>
+      <w:pPr>
+        <w:pStyle w:val="Compact"/>
+        <w:numPr>
+          <w:ilvl w:val="0"/>
+          <w:numId w:val="1005"/>
+        </w:numPr>
+      </w:pPr>
+      <w:r>
+        <w:t xml:space="preserve">Prüfungen vor dem Versand: Unbrauchbare Modellantworten stoppen den Lauf; Modell-Kaskade (Claude, Gemini, Groq) mit Sperrzeiten.</w:t>
+      </w:r>
+    </w:p>
+    <w:p>
+      <w:pPr>
+        <w:pStyle w:val="Compact"/>
+        <w:numPr>
+          <w:ilvl w:val="0"/>
+          <w:numId w:val="1005"/>
+        </w:numPr>
+      </w:pPr>
+      <w:r>
+        <w:t xml:space="preserve">Bewertungsqualität: LLM-Bewertungen gegen blinde Referenzurteile geprüft; eine überarbeitete Analyse nach unvollständiger Messung ohne belegte Verbesserung nicht ausgerollt.</w:t>
+      </w:r>
+    </w:p>
+    <w:p>
+      <w:pPr>
+        <w:pStyle w:val="Compact"/>
+        <w:numPr>
+          <w:ilvl w:val="0"/>
+          <w:numId w:val="1005"/>
+        </w:numPr>
+      </w:pPr>
+      <w:r>
+        <w:t xml:space="preserve">Betrieb: Rollouts mit Prüfsummen, Tests vor und nach dem Tausch und automatischem Rückbau bei abgefangenen Fehlern.</w:t>
       </w:r>
     </w:p>
     <w:bookmarkEnd w:id="14"/>
-    <w:bookmarkStart w:id="15" w:name="weitere-projekte"/>
-    <w:p>
-      <w:pPr>
-        <w:pStyle w:val="Heading2"/>
-      </w:pPr>
-      <w:r>
-        <w:t xml:space="preserve">Weitere Projekte</w:t>
-      </w:r>
-    </w:p>
-    <w:p>
-      <w:pPr>
-        <w:pStyle w:val="Compact"/>
-        <w:numPr>
-          <w:ilvl w:val="0"/>
-          <w:numId w:val="1005"/>
-        </w:numPr>
-      </w:pPr>
-      <w:r>
-        <w:t xml:space="preserve">hermes-brett: Aufgabenbrett-Plugin für Hermes Agent ohne Build-Schritt; ein Kosten-Gate verhindert, dass das Brett versehentlich einen bezahlten Agentenlauf startet; Deploy mit Rollback; Selbsttest nur mit node:assert.</w:t>
-      </w:r>
-    </w:p>
-    <w:p>
-      <w:pPr>
-        <w:pStyle w:val="Compact"/>
-        <w:numPr>
-          <w:ilvl w:val="0"/>
-          <w:numId w:val="1005"/>
-        </w:numPr>
-      </w:pPr>
-      <w:r>
-        <w:t xml:space="preserve">Shinobi: Ember Accord — mobiles Idle-RPG (React Native, Skia, Supabase, pgTAP). Agenten-orchestriert: Ein KI-Agent arbeitet im Lead-Modus 50 Rollen ab, die Produktentscheidungen treffe ich.</w:t>
-      </w:r>
-    </w:p>
-    <w:p>
-      <w:pPr>
-        <w:pStyle w:val="Compact"/>
-        <w:numPr>
-          <w:ilvl w:val="0"/>
-          <w:numId w:val="1005"/>
-        </w:numPr>
-      </w:pPr>
-      <w:r>
-        <w:t xml:space="preserve">Interaktives Web-CV — installierbare PWA ohne Framework: SVG-Displacement, Canvas, WebGL-Fluidsimulation (adaptiert, MIT-Lizenz).</w:t>
-      </w:r>
-    </w:p>
     <w:bookmarkEnd w:id="15"/>
     <w:bookmarkStart w:id="18" w:name="berufserfahrung"/>
     <w:p>
@@ -442,25 +434,13 @@
         <w:t xml:space="preserve">Berufserfahrung</w:t>
       </w:r>
     </w:p>
-    <w:bookmarkStart w:id="16" w:name="ki-automation-webentwicklung"/>
+    <w:bookmarkStart w:id="16" w:name="X3642cf377bf71d3c3f64fa7844500461598c427"/>
     <w:p>
       <w:pPr>
         <w:pStyle w:val="Heading3"/>
       </w:pPr>
       <w:r>
-        <w:t xml:space="preserve">KI-Automation &amp; Webentwicklung</w:t>
-      </w:r>
-    </w:p>
-    <w:p>
-      <w:pPr>
-        <w:pStyle w:val="FirstParagraph"/>
-      </w:pPr>
-      <w:r>
-        <w:rPr>
-          <w:b/>
-          <w:bCs/>
-        </w:rPr>
-        <w:t xml:space="preserve">2024 – heute | Eigene Projekte, Team- und Kundenprojekte | Hamburg / remote</w:t>
+        <w:t xml:space="preserve">KI-Automation &amp; Webentwicklung — Eigene Projekte, Team- und Kundenprojekte (2024 – heute)</w:t>
       </w:r>
     </w:p>
     <w:p>
@@ -475,26 +455,26 @@
         <w:t xml:space="preserve">Python-Backends und Next.js-Frontends entwickelt, getestet und auf Linux-Servern betrieben (Docker Compose, Cron, Deployment mit Rollback); Shopify-Themes angepasst; im Team über Branches, Pull Requests und gemeinsame Test-Suites.</w:t>
       </w:r>
     </w:p>
+    <w:p>
+      <w:pPr>
+        <w:pStyle w:val="Compact"/>
+        <w:numPr>
+          <w:ilvl w:val="0"/>
+          <w:numId w:val="1006"/>
+        </w:numPr>
+      </w:pPr>
+      <w:r>
+        <w:t xml:space="preserve">nk247store.de (Kundenprojekt im Team): interaktive Überarbeitung mit Next.js und GSAP; CI mit TypeScript-Check, ESLint, Vitest, Build und Playwright. Meine Überarbeitung ist noch nicht veröffentlicht.</w:t>
+      </w:r>
+    </w:p>
     <w:bookmarkEnd w:id="16"/>
-    <w:bookmarkStart w:id="17" w:name="b2b-direktvertrieb-door-to-door"/>
+    <w:bookmarkStart w:id="17" w:name="X1915a06831d154184e90fcc133d22bf8aaac68c"/>
     <w:p>
       <w:pPr>
         <w:pStyle w:val="Heading3"/>
       </w:pPr>
       <w:r>
-        <w:t xml:space="preserve">B2B-Direktvertrieb (Door-to-Door)</w:t>
-      </w:r>
-    </w:p>
-    <w:p>
-      <w:pPr>
-        <w:pStyle w:val="FirstParagraph"/>
-      </w:pPr>
-      <w:r>
-        <w:rPr>
-          <w:b/>
-          <w:bCs/>
-        </w:rPr>
-        <w:t xml:space="preserve">2019 – 2023 | EWE TEL, Ranger Marketing | Außendienst bundesweit</w:t>
+        <w:t xml:space="preserve">B2B-Direktvertrieb — Außendienst bundesweit, EWE TEL und Ranger Marketing (2019 – 2023)</w:t>
       </w:r>
     </w:p>
     <w:p>
@@ -518,18 +498,18 @@
         </w:numPr>
       </w:pPr>
       <w:r>
-        <w:t xml:space="preserve">Täglicher Umgang mit Absagen — und der Blick dafür, welche Probleme ein Betrieb wirklich hat.</w:t>
+        <w:t xml:space="preserve">Täglicher Umgang mit Absagen – und der Blick dafür, welche Probleme ein Betrieb wirklich hat.</w:t>
       </w:r>
     </w:p>
     <w:bookmarkEnd w:id="17"/>
     <w:bookmarkEnd w:id="18"/>
-    <w:bookmarkStart w:id="20" w:name="weiterbildung-und-projektpraxis"/>
+    <w:bookmarkStart w:id="19" w:name="kenntnisse-arbeitsweise"/>
     <w:p>
       <w:pPr>
         <w:pStyle w:val="Heading2"/>
       </w:pPr>
       <w:r>
-        <w:t xml:space="preserve">Weiterbildung und Projektpraxis</w:t>
+        <w:t xml:space="preserve">Kenntnisse &amp; Arbeitsweise</w:t>
       </w:r>
     </w:p>
     <w:p>
@@ -541,7 +521,7 @@
         </w:numPr>
       </w:pPr>
       <w:r>
-        <w:t xml:space="preserve">Weiterbildung Webentwicklung, 2024 (6 Monate): HTML, CSS, JavaScript, Web-Architektur</w:t>
+        <w:t xml:space="preserve">Entwicklung: Python, FastAPI · TypeScript, React, Next.js, discord.js · React Native (Projektpraxis: Shinobi)</w:t>
       </w:r>
     </w:p>
     <w:p>
@@ -553,12 +533,106 @@
         </w:numPr>
       </w:pPr>
       <w:r>
-        <w:t xml:space="preserve">Google Ads Search Certification (Skillshop), Dezember 2025, gültig bis 03.12.2026 – verifizierbar:</w:t>
+        <w:t xml:space="preserve">KI &amp; Agenten: Claude Code, LLM-APIs (Claude, Gemini, Groq), MCP, Agenten-Orchestrierung, n8n</w:t>
+      </w:r>
+    </w:p>
+    <w:p>
+      <w:pPr>
+        <w:pStyle w:val="Compact"/>
+        <w:numPr>
+          <w:ilvl w:val="0"/>
+          <w:numId w:val="1008"/>
+        </w:numPr>
+      </w:pPr>
+      <w:r>
+        <w:t xml:space="preserve">Daten &amp; Jobs: PostgreSQL, SQLAlchemy/Alembic, Celery, Redis, Supabase</w:t>
+      </w:r>
+    </w:p>
+    <w:p>
+      <w:pPr>
+        <w:pStyle w:val="Compact"/>
+        <w:numPr>
+          <w:ilvl w:val="0"/>
+          <w:numId w:val="1008"/>
+        </w:numPr>
+      </w:pPr>
+      <w:r>
+        <w:t xml:space="preserve">Qualität: pytest, Vitest, Playwright, GitHub Actions, Lighthouse-CI</w:t>
+      </w:r>
+    </w:p>
+    <w:p>
+      <w:pPr>
+        <w:pStyle w:val="Compact"/>
+        <w:numPr>
+          <w:ilvl w:val="0"/>
+          <w:numId w:val="1008"/>
+        </w:numPr>
+      </w:pPr>
+      <w:r>
+        <w:t xml:space="preserve">Betrieb: Linux-Server, Docker Compose, Cron, flock, SMTP/IMAP, SPF/DKIM</w:t>
+      </w:r>
+    </w:p>
+    <w:p>
+      <w:pPr>
+        <w:pStyle w:val="Compact"/>
+        <w:numPr>
+          <w:ilvl w:val="0"/>
+          <w:numId w:val="1008"/>
+        </w:numPr>
+      </w:pPr>
+      <w:r>
+        <w:t xml:space="preserve">Web &amp; Commerce: Shopify Liquid, Tailwind, GSAP, PWA, Canvas/WebGL</w:t>
+      </w:r>
+    </w:p>
+    <w:p>
+      <w:pPr>
+        <w:pStyle w:val="Compact"/>
+        <w:numPr>
+          <w:ilvl w:val="0"/>
+          <w:numId w:val="1008"/>
+        </w:numPr>
+      </w:pPr>
+      <w:r>
+        <w:t xml:space="preserve">Mit KI-Agenten: Fehler zuerst als roter Test · Agent setzt um · ein zweites Modell prüft zusätzlich als Reviewer · Rollout mit Prüfsummen und automatischem Rückbau bei abgefangenen Fehlern</w:t>
+      </w:r>
+    </w:p>
+    <w:bookmarkEnd w:id="19"/>
+    <w:bookmarkStart w:id="21" w:name="weiterbildung-zertifikat-sprachen"/>
+    <w:p>
+      <w:pPr>
+        <w:pStyle w:val="Heading2"/>
+      </w:pPr>
+      <w:r>
+        <w:t xml:space="preserve">Weiterbildung, Zertifikat &amp; Sprachen</w:t>
+      </w:r>
+    </w:p>
+    <w:p>
+      <w:pPr>
+        <w:pStyle w:val="Compact"/>
+        <w:numPr>
+          <w:ilvl w:val="0"/>
+          <w:numId w:val="1009"/>
+        </w:numPr>
+      </w:pPr>
+      <w:r>
+        <w:t xml:space="preserve">Weiterbildung: Webentwicklung (2024, 6 Monate): HTML, CSS, JavaScript, Web-Architektur</w:t>
+      </w:r>
+    </w:p>
+    <w:p>
+      <w:pPr>
+        <w:pStyle w:val="Compact"/>
+        <w:numPr>
+          <w:ilvl w:val="0"/>
+          <w:numId w:val="1009"/>
+        </w:numPr>
+      </w:pPr>
+      <w:r>
+        <w:t xml:space="preserve">Zertifikat: Google Ads Search Certification (Skillshop), Dezember 2025, gültig bis 03.12.2026 – verifizierbar:</w:t>
       </w:r>
       <w:r>
         <w:t xml:space="preserve"> </w:t>
       </w:r>
-      <w:hyperlink r:id="rId19">
+      <w:hyperlink r:id="rId20">
         <w:r>
           <w:rPr>
             <w:rStyle w:val="Hyperlink"/>
@@ -567,16 +641,6 @@
         </w:r>
       </w:hyperlink>
     </w:p>
-    <w:bookmarkEnd w:id="20"/>
-    <w:bookmarkStart w:id="21" w:name="kenntnisse-in-projekten-eingesetzt"/>
-    <w:p>
-      <w:pPr>
-        <w:pStyle w:val="Heading2"/>
-      </w:pPr>
-      <w:r>
-        <w:t xml:space="preserve">Kenntnisse (in Projekten eingesetzt)</w:t>
-      </w:r>
-    </w:p>
     <w:p>
       <w:pPr>
         <w:pStyle w:val="Compact"/>
@@ -586,7 +650,7 @@
         </w:numPr>
       </w:pPr>
       <w:r>
-        <w:t xml:space="preserve">Entwicklung: Python, FastAPI, TypeScript, React, Next.js, React Native</w:t>
+        <w:t xml:space="preserve">Sprachen: Deutsch (Muttersprache) · Englisch (B1, Richtung B2) · Polnisch (mündlich)</w:t>
       </w:r>
     </w:p>
     <w:p>
@@ -598,81 +662,11 @@
         </w:numPr>
       </w:pPr>
       <w:r>
-        <w:t xml:space="preserve">KI &amp; Agenten: Claude Code, LLM-APIs (Claude, Gemini, Groq), MCP, Agenten-Orchestrierung, n8n</w:t>
-      </w:r>
-    </w:p>
-    <w:p>
-      <w:pPr>
-        <w:pStyle w:val="Compact"/>
-        <w:numPr>
-          <w:ilvl w:val="0"/>
-          <w:numId w:val="1009"/>
-        </w:numPr>
-      </w:pPr>
-      <w:r>
-        <w:t xml:space="preserve">Daten &amp; Jobs: PostgreSQL, SQLAlchemy/Alembic, Celery, Redis, Supabase</w:t>
-      </w:r>
-    </w:p>
-    <w:p>
-      <w:pPr>
-        <w:pStyle w:val="Compact"/>
-        <w:numPr>
-          <w:ilvl w:val="0"/>
-          <w:numId w:val="1009"/>
-        </w:numPr>
-      </w:pPr>
-      <w:r>
-        <w:t xml:space="preserve">Qualität: pytest, Vitest, Playwright, GitHub Actions, Lighthouse-CI</w:t>
-      </w:r>
-    </w:p>
-    <w:p>
-      <w:pPr>
-        <w:pStyle w:val="Compact"/>
-        <w:numPr>
-          <w:ilvl w:val="0"/>
-          <w:numId w:val="1009"/>
-        </w:numPr>
-      </w:pPr>
-      <w:r>
-        <w:t xml:space="preserve">Betrieb: Linux-Server, Docker Compose, Cron, flock, SMTP/IMAP, SPF/DKIM</w:t>
-      </w:r>
-    </w:p>
-    <w:p>
-      <w:pPr>
-        <w:pStyle w:val="Compact"/>
-        <w:numPr>
-          <w:ilvl w:val="0"/>
-          <w:numId w:val="1009"/>
-        </w:numPr>
-      </w:pPr>
-      <w:r>
-        <w:t xml:space="preserve">Web &amp; Commerce: Shopify Liquid, Tailwind, GSAP, PWA, Canvas/WebGL</w:t>
+        <w:t xml:space="preserve">Remote-Arbeit: Verteilte Teamarbeit über GitHub (Branches, Pull Requests), Discord und Online-Calls</w:t>
       </w:r>
     </w:p>
     <w:bookmarkEnd w:id="21"/>
-    <w:bookmarkStart w:id="22" w:name="sprachen"/>
-    <w:p>
-      <w:pPr>
-        <w:pStyle w:val="Heading2"/>
-      </w:pPr>
-      <w:r>
-        <w:t xml:space="preserve">Sprachen</w:t>
-      </w:r>
-    </w:p>
-    <w:p>
-      <w:pPr>
-        <w:pStyle w:val="Compact"/>
-        <w:numPr>
-          <w:ilvl w:val="0"/>
-          <w:numId w:val="1010"/>
-        </w:numPr>
-      </w:pPr>
-      <w:r>
-        <w:t xml:space="preserve">Deutsch: Muttersprache · Englisch: B1, Richtung B2 · Polnisch: mündlich</w:t>
-      </w:r>
-    </w:p>
     <w:bookmarkEnd w:id="22"/>
-    <w:bookmarkEnd w:id="23"/>
     <w:sectPr>
       <w:footnotePr>
         <w:numRestart w:val="eachSect"/>
@@ -914,9 +908,6 @@
     <w:abstractNumId w:val="991"/>
   </w:num>
   <w:num w:numId="1009">
-    <w:abstractNumId w:val="991"/>
-  </w:num>
-  <w:num w:numId="1010">
     <w:abstractNumId w:val="991"/>
   </w:num>
 </w:numbering>

</xml_diff>

<commit_message>
feat(cv): v4-Feinschliff – Belege, Kontaktzeile, Handy-Direktlinks, strengere Prüfung
- Druck-CVs (Marketing, Entwickler DE/EN): Kontaktzeile mit Symbolen und
  klickbaren Kurznamen; Beleg-Zeilen mit Links (Kundenshop, Belegmappe,
  Web-CV-Fallstudien #fs-01..03); Marketing: FlowKI Club inkl. Outreach als
  Zweck, Kenntnisse "Content & Community"; hermes-Nachweis auf belegte
  Zahlen "177 -> 199" zurückgesetzt
- ATS-Fassungen angeglichen, alle auf 2 Seiten (Kreativ-KI nur im Druck)
- Web-CV: Direktlinks aus dem PDF öffnen Ansicht bzw. Handy-App und legen
  das Ziel unter die App-Kopfleiste (scroll-margin-top + Ausrichtung nach
  Zoom-Ende); Sprung setzt einen aktiven Atlas-Filter zurück; Vibration nur
  nach Nutzeraktion; Clip-Studio verdichtet, flowki-club.de nicht verlinkt
- Prüfskript: Fußzeilenabstand per bbox (Fußzeile über exakte Textmaße
  erkannt), Link-Ziele per pdfinfo -url, "aufgebaut auf" verboten;
  Selbsttest scripts/test_cv_pruefung.py
</commit_message>
<xml_diff>
--- a/ats-cv/Jason_Roschmann_CV_ATS.docx
+++ b/ats-cv/Jason_Roschmann_CV_ATS.docx
@@ -2,7 +2,7 @@
 <file path=word/document.xml><?xml version="1.0" encoding="utf-8"?>
 <w:document xmlns:w="http://schemas.openxmlformats.org/wordprocessingml/2006/main" xmlns:m="http://schemas.openxmlformats.org/officeDocument/2006/math" xmlns:r="http://schemas.openxmlformats.org/officeDocument/2006/relationships" xmlns:o="urn:schemas-microsoft-com:office:office" xmlns:v="urn:schemas-microsoft-com:vml" xmlns:w10="urn:schemas-microsoft-com:office:word" xmlns:a="http://schemas.openxmlformats.org/drawingml/2006/main" xmlns:pic="http://schemas.openxmlformats.org/drawingml/2006/picture" xmlns:wp="http://schemas.openxmlformats.org/drawingml/2006/wordprocessingDrawing">
   <w:body>
-    <w:bookmarkStart w:id="22" w:name="jason-roschmann"/>
+    <w:bookmarkStart w:id="25" w:name="jason-roschmann"/>
     <w:p>
       <w:pPr>
         <w:pStyle w:val="Heading1"/>
@@ -16,7 +16,7 @@
         <w:pStyle w:val="FirstParagraph"/>
       </w:pPr>
       <w:r>
-        <w:t xml:space="preserve">Junior Softwareentwickler / Software Engineer · Python · TypeScript · KI-Automation</w:t>
+        <w:t xml:space="preserve">Junior Softwareentwickler / Software Engineer · Python · FastAPI · TypeScript · Next.js · PostgreSQL · Docker</w:t>
       </w:r>
     </w:p>
     <w:p>
@@ -61,11 +61,11 @@
         <w:pStyle w:val="BodyText"/>
       </w:pPr>
       <w:r>
-        <w:t xml:space="preserve">Kennzahlen: 50 eigene Pull Requests gemergt (Flowki Studio, Teamprojekt) · 21 → 0 rote Tests, zwei Ursachen behoben (hermes-studio) · rund 66 Discord-Mitglieder FlowKI Club (Stand 29.09.2026) · 4 Jahre B2B-Vertrieb mit täglichem Kundenkontakt (2019–2023)</w:t>
+        <w:t xml:space="preserve">Kennzahlen: 50 eigene Pull Requests gemergt (Flowki Studio) · 21 → 0 rote Tests (hermes-studio) · rund 66 Discord-Mitglieder FlowKI Club (Stand 29.09.2026) · 4 Jahre B2B-Vertrieb (2019–2023)</w:t>
       </w:r>
     </w:p>
     <w:bookmarkEnd w:id="9"/>
-    <w:bookmarkStart w:id="15" w:name="projekte"/>
+    <w:bookmarkStart w:id="18" w:name="projekte"/>
     <w:p>
       <w:pPr>
         <w:pStyle w:val="Heading2"/>
@@ -88,7 +88,7 @@
         <w:pStyle w:val="FirstParagraph"/>
       </w:pPr>
       <w:r>
-        <w:t xml:space="preserve">Zweck: Internes Social-Media-Studio für Themenrecherche, KI-gestützte Content-Produktion, redaktionelle Prüfung und Plattformübergabe; mein Beitrag im Team: Produktoberflächen, Workflow-Integration, Clip-Verarbeitung und Publishing.</w:t>
+        <w:t xml:space="preserve">Zweck: Internes Social-Media-Studio für Themenrecherche, KI-gestützte Content-Produktion, redaktionelle Prüfung und Plattformübergabe; mein Beitrag im Team (50 eigene Pull Requests gemergt): Produktoberflächen, Workflow-Integration, Clip-Verarbeitung und Publishing.</w:t>
       </w:r>
     </w:p>
     <w:p>
@@ -149,18 +149,6 @@
       </w:pPr>
       <w:r>
         <w:t xml:space="preserve">Publishing: TikTok-Entwurfsweg mit eigenem Status und Nutzerhinweis integriert – hochgeladene Entwürfe eindeutig von veröffentlichten Posts unterschieden.</w:t>
-      </w:r>
-    </w:p>
-    <w:p>
-      <w:pPr>
-        <w:pStyle w:val="Compact"/>
-        <w:numPr>
-          <w:ilvl w:val="0"/>
-          <w:numId w:val="1001"/>
-        </w:numPr>
-      </w:pPr>
-      <w:r>
-        <w:t xml:space="preserve">Qualitätssicherung: Fehlerfälle zuerst reproduziert und durch gezielte Gegenproben abgesichert.</w:t>
       </w:r>
     </w:p>
     <w:p>
@@ -198,7 +186,7 @@
         </w:numPr>
       </w:pPr>
       <w:r>
-        <w:t xml:space="preserve">Community-Werkzeuge: Discord-Bot um /ask und Self-Service-Themenrollen erweitert; Discord.js und Testwerkzeuge aktualisiert.</w:t>
+        <w:t xml:space="preserve">Community-Werkzeuge: Discord-Bot um /ask und Self-Service-Themenrollen erweitert; discord.js und Testwerkzeuge aktualisiert.</w:t>
       </w:r>
     </w:p>
     <w:p>
@@ -234,7 +222,7 @@
         </w:numPr>
       </w:pPr>
       <w:r>
-        <w:t xml:space="preserve">Community: Mitglieder beim Einstieg begleitet, Online-Calls organisiert und moderiert, bei ihren Projekten unterstützt.</w:t>
+        <w:t xml:space="preserve">Community: Mitglieder beim Einstieg begleitet, Online-Calls organisiert und moderiert, bei Projekten unterstützt.</w:t>
       </w:r>
     </w:p>
     <w:p>
@@ -246,7 +234,7 @@
       </w:r>
     </w:p>
     <w:bookmarkEnd w:id="11"/>
-    <w:bookmarkStart w:id="12" w:name="X5c28e3663588d156f962f0df303720ee67b6052"/>
+    <w:bookmarkStart w:id="13" w:name="X5c28e3663588d156f962f0df303720ee67b6052"/>
     <w:p>
       <w:pPr>
         <w:pStyle w:val="Heading3"/>
@@ -276,7 +264,7 @@
         </w:numPr>
       </w:pPr>
       <w:r>
-        <w:t xml:space="preserve">Nachweis: Mutationsprobe – mit abgeschwächter Sicherheitsregel scheitert der korrigierte Test; bestandene Tests: 177/198 → 199/199.</w:t>
+        <w:t xml:space="preserve">Nachweis: Mutationsprobe – mit abgeschwächter Sicherheitsregel scheitert der korrigierte Test; grüne Tests: 177 → 199.</w:t>
       </w:r>
     </w:p>
     <w:p>
@@ -291,8 +279,27 @@
         <w:t xml:space="preserve">Eigener Beitrag: Stillen Datenverlust im Task-Store behoben, mit fünf neuen Tests.</w:t>
       </w:r>
     </w:p>
-    <w:bookmarkEnd w:id="12"/>
-    <w:bookmarkStart w:id="13" w:name="X588b0a18a79db9064ad2be76a698cef3d3cf720"/>
+    <w:p>
+      <w:pPr>
+        <w:pStyle w:val="FirstParagraph"/>
+      </w:pPr>
+      <w:r>
+        <w:t xml:space="preserve">Beleg: Fallstudie im Web-CV</w:t>
+      </w:r>
+      <w:r>
+        <w:t xml:space="preserve"> </w:t>
+      </w:r>
+      <w:hyperlink r:id="rId12">
+        <w:r>
+          <w:rPr>
+            <w:rStyle w:val="Hyperlink"/>
+          </w:rPr>
+          <w:t xml:space="preserve">https://jasonroschmann.github.io/cv/#fs-01</w:t>
+        </w:r>
+      </w:hyperlink>
+    </w:p>
+    <w:bookmarkEnd w:id="13"/>
+    <w:bookmarkStart w:id="14" w:name="X588b0a18a79db9064ad2be76a698cef3d3cf720"/>
     <w:p>
       <w:pPr>
         <w:pStyle w:val="Heading3"/>
@@ -357,8 +364,8 @@
         <w:t xml:space="preserve">Tools: Shopify Liquid, Admin-GraphQL-API, Python, GitHub Actions, Klaviyo</w:t>
       </w:r>
     </w:p>
-    <w:bookmarkEnd w:id="13"/>
-    <w:bookmarkStart w:id="14" w:name="X27dd574a98008e548c9b2d0e8137d7142d40707"/>
+    <w:bookmarkEnd w:id="14"/>
+    <w:bookmarkStart w:id="17" w:name="X27dd574a98008e548c9b2d0e8137d7142d40707"/>
     <w:p>
       <w:pPr>
         <w:pStyle w:val="Heading3"/>
@@ -423,92 +430,128 @@
         <w:t xml:space="preserve">Betrieb: Rollouts mit Prüfsummen, Tests vor und nach dem Tausch und automatischem Rückbau bei abgefangenen Fehlern.</w:t>
       </w:r>
     </w:p>
-    <w:bookmarkEnd w:id="14"/>
-    <w:bookmarkEnd w:id="15"/>
-    <w:bookmarkStart w:id="18" w:name="berufserfahrung"/>
-    <w:p>
-      <w:pPr>
-        <w:pStyle w:val="Heading2"/>
-      </w:pPr>
-      <w:r>
-        <w:t xml:space="preserve">Berufserfahrung</w:t>
-      </w:r>
-    </w:p>
-    <w:bookmarkStart w:id="16" w:name="X3642cf377bf71d3c3f64fa7844500461598c427"/>
-    <w:p>
-      <w:pPr>
-        <w:pStyle w:val="Heading3"/>
-      </w:pPr>
-      <w:r>
-        <w:t xml:space="preserve">KI-Automation &amp; Webentwicklung — Eigene Projekte, Team- und Kundenprojekte (2024 – heute)</w:t>
-      </w:r>
-    </w:p>
-    <w:p>
-      <w:pPr>
-        <w:pStyle w:val="Compact"/>
-        <w:numPr>
-          <w:ilvl w:val="0"/>
-          <w:numId w:val="1006"/>
-        </w:numPr>
-      </w:pPr>
-      <w:r>
-        <w:t xml:space="preserve">Python-Backends und Next.js-Frontends entwickelt, getestet und auf Linux-Servern betrieben (Docker Compose, Cron, Deployment mit Rollback); Shopify-Themes angepasst; im Team über Branches, Pull Requests und gemeinsame Test-Suites.</w:t>
-      </w:r>
-    </w:p>
-    <w:p>
-      <w:pPr>
-        <w:pStyle w:val="Compact"/>
-        <w:numPr>
-          <w:ilvl w:val="0"/>
-          <w:numId w:val="1006"/>
-        </w:numPr>
-      </w:pPr>
-      <w:r>
-        <w:t xml:space="preserve">nk247store.de (Kundenprojekt im Team): interaktive Überarbeitung mit Next.js und GSAP; CI mit TypeScript-Check, ESLint, Vitest, Build und Playwright. Meine Überarbeitung ist noch nicht veröffentlicht.</w:t>
-      </w:r>
-    </w:p>
-    <w:bookmarkEnd w:id="16"/>
-    <w:bookmarkStart w:id="17" w:name="X1915a06831d154184e90fcc133d22bf8aaac68c"/>
-    <w:p>
-      <w:pPr>
-        <w:pStyle w:val="Heading3"/>
-      </w:pPr>
-      <w:r>
-        <w:t xml:space="preserve">B2B-Direktvertrieb — Außendienst bundesweit, EWE TEL und Ranger Marketing (2019 – 2023)</w:t>
-      </w:r>
-    </w:p>
-    <w:p>
-      <w:pPr>
-        <w:pStyle w:val="Compact"/>
-        <w:numPr>
-          <w:ilvl w:val="0"/>
-          <w:numId w:val="1007"/>
-        </w:numPr>
-      </w:pPr>
-      <w:r>
-        <w:t xml:space="preserve">Kaltakquise und Bedarfsgespräche mit Inhabern und Geschäftsführern, Verhandlung und Abschluss vor Ort.</w:t>
-      </w:r>
-    </w:p>
-    <w:p>
-      <w:pPr>
-        <w:pStyle w:val="Compact"/>
-        <w:numPr>
-          <w:ilvl w:val="0"/>
-          <w:numId w:val="1007"/>
-        </w:numPr>
-      </w:pPr>
-      <w:r>
-        <w:t xml:space="preserve">Täglicher Umgang mit Absagen – und der Blick dafür, welche Probleme ein Betrieb wirklich hat.</w:t>
-      </w:r>
+    <w:p>
+      <w:pPr>
+        <w:pStyle w:val="FirstParagraph"/>
+      </w:pPr>
+      <w:r>
+        <w:t xml:space="preserve">Belege: Fallstudie Antwortzuordnung</w:t>
+      </w:r>
+      <w:r>
+        <w:t xml:space="preserve"> </w:t>
+      </w:r>
+      <w:hyperlink r:id="rId15">
+        <w:r>
+          <w:rPr>
+            <w:rStyle w:val="Hyperlink"/>
+          </w:rPr>
+          <w:t xml:space="preserve">https://jasonroschmann.github.io/cv/#fs-02</w:t>
+        </w:r>
+      </w:hyperlink>
+      <w:r>
+        <w:t xml:space="preserve"> </w:t>
+      </w:r>
+      <w:r>
+        <w:t xml:space="preserve">· Fallstudie LLM-Bewertung</w:t>
+      </w:r>
+      <w:r>
+        <w:t xml:space="preserve"> </w:t>
+      </w:r>
+      <w:hyperlink r:id="rId16">
+        <w:r>
+          <w:rPr>
+            <w:rStyle w:val="Hyperlink"/>
+          </w:rPr>
+          <w:t xml:space="preserve">https://jasonroschmann.github.io/cv/#fs-03</w:t>
+        </w:r>
+      </w:hyperlink>
     </w:p>
     <w:bookmarkEnd w:id="17"/>
     <w:bookmarkEnd w:id="18"/>
-    <w:bookmarkStart w:id="19" w:name="kenntnisse-arbeitsweise"/>
+    <w:bookmarkStart w:id="21" w:name="berufserfahrung"/>
     <w:p>
       <w:pPr>
         <w:pStyle w:val="Heading2"/>
       </w:pPr>
       <w:r>
+        <w:t xml:space="preserve">Berufserfahrung</w:t>
+      </w:r>
+    </w:p>
+    <w:bookmarkStart w:id="19" w:name="X3642cf377bf71d3c3f64fa7844500461598c427"/>
+    <w:p>
+      <w:pPr>
+        <w:pStyle w:val="Heading3"/>
+      </w:pPr>
+      <w:r>
+        <w:t xml:space="preserve">KI-Automation &amp; Webentwicklung — Eigene Projekte, Team- und Kundenprojekte (2024 – heute)</w:t>
+      </w:r>
+    </w:p>
+    <w:p>
+      <w:pPr>
+        <w:pStyle w:val="Compact"/>
+        <w:numPr>
+          <w:ilvl w:val="0"/>
+          <w:numId w:val="1006"/>
+        </w:numPr>
+      </w:pPr>
+      <w:r>
+        <w:t xml:space="preserve">Python-Backends und Next.js-Frontends entwickelt, getestet und auf Linux-Servern betrieben (Docker Compose, Cron, Deployment mit Rollback); Shopify-Themes angepasst; im Team über Branches, Pull Requests und gemeinsame Test-Suites.</w:t>
+      </w:r>
+    </w:p>
+    <w:p>
+      <w:pPr>
+        <w:pStyle w:val="Compact"/>
+        <w:numPr>
+          <w:ilvl w:val="0"/>
+          <w:numId w:val="1006"/>
+        </w:numPr>
+      </w:pPr>
+      <w:r>
+        <w:t xml:space="preserve">nk247store.de (Kundenprojekt im Team): interaktive Überarbeitung mit Next.js und GSAP; CI mit TypeScript-Check, ESLint, Vitest, Build und Playwright. Meine Überarbeitung ist noch nicht veröffentlicht.</w:t>
+      </w:r>
+    </w:p>
+    <w:bookmarkEnd w:id="19"/>
+    <w:bookmarkStart w:id="20" w:name="X1915a06831d154184e90fcc133d22bf8aaac68c"/>
+    <w:p>
+      <w:pPr>
+        <w:pStyle w:val="Heading3"/>
+      </w:pPr>
+      <w:r>
+        <w:t xml:space="preserve">B2B-Direktvertrieb — Außendienst bundesweit, EWE TEL und Ranger Marketing (2019 – 2023)</w:t>
+      </w:r>
+    </w:p>
+    <w:p>
+      <w:pPr>
+        <w:pStyle w:val="Compact"/>
+        <w:numPr>
+          <w:ilvl w:val="0"/>
+          <w:numId w:val="1007"/>
+        </w:numPr>
+      </w:pPr>
+      <w:r>
+        <w:t xml:space="preserve">Kaltakquise und Bedarfsgespräche mit Inhabern und Geschäftsführern, Verhandlung und Abschluss vor Ort.</w:t>
+      </w:r>
+    </w:p>
+    <w:p>
+      <w:pPr>
+        <w:pStyle w:val="Compact"/>
+        <w:numPr>
+          <w:ilvl w:val="0"/>
+          <w:numId w:val="1007"/>
+        </w:numPr>
+      </w:pPr>
+      <w:r>
+        <w:t xml:space="preserve">Täglicher Umgang mit Absagen – und der Blick dafür, welche Probleme ein Betrieb wirklich hat.</w:t>
+      </w:r>
+    </w:p>
+    <w:bookmarkEnd w:id="20"/>
+    <w:bookmarkEnd w:id="21"/>
+    <w:bookmarkStart w:id="22" w:name="kenntnisse-arbeitsweise"/>
+    <w:p>
+      <w:pPr>
+        <w:pStyle w:val="Heading2"/>
+      </w:pPr>
+      <w:r>
         <w:t xml:space="preserve">Kenntnisse &amp; Arbeitsweise</w:t>
       </w:r>
     </w:p>
@@ -521,7 +564,7 @@
         </w:numPr>
       </w:pPr>
       <w:r>
-        <w:t xml:space="preserve">Entwicklung: Python, FastAPI · TypeScript, React, Next.js, discord.js · React Native (Projektpraxis: Shinobi)</w:t>
+        <w:t xml:space="preserve">Entwicklung: Python, REST-APIs mit FastAPI · TypeScript, React, Next.js, discord.js · React Native (Eigenprojekt)</w:t>
       </w:r>
     </w:p>
     <w:p>
@@ -545,7 +588,7 @@
         </w:numPr>
       </w:pPr>
       <w:r>
-        <w:t xml:space="preserve">Daten &amp; Jobs: PostgreSQL, SQLAlchemy/Alembic, Celery, Redis, Supabase</w:t>
+        <w:t xml:space="preserve">Daten &amp; Jobs: SQL/PostgreSQL, SQLAlchemy/Alembic, Celery, Redis, Supabase</w:t>
       </w:r>
     </w:p>
     <w:p>
@@ -557,7 +600,7 @@
         </w:numPr>
       </w:pPr>
       <w:r>
-        <w:t xml:space="preserve">Qualität: pytest, Vitest, Playwright, GitHub Actions, Lighthouse-CI</w:t>
+        <w:t xml:space="preserve">Qualität: Git, CI/CD mit GitHub Actions, pytest, Vitest, Playwright, Lighthouse-CI</w:t>
       </w:r>
     </w:p>
     <w:p>
@@ -596,8 +639,8 @@
         <w:t xml:space="preserve">Mit KI-Agenten: Fehler zuerst als roter Test · Agent setzt um · ein zweites Modell prüft zusätzlich als Reviewer · Rollout mit Prüfsummen und automatischem Rückbau bei abgefangenen Fehlern</w:t>
       </w:r>
     </w:p>
-    <w:bookmarkEnd w:id="19"/>
-    <w:bookmarkStart w:id="21" w:name="weiterbildung-zertifikat-sprachen"/>
+    <w:bookmarkEnd w:id="22"/>
+    <w:bookmarkStart w:id="24" w:name="weiterbildung-zertifikat-sprachen"/>
     <w:p>
       <w:pPr>
         <w:pStyle w:val="Heading2"/>
@@ -632,7 +675,7 @@
       <w:r>
         <w:t xml:space="preserve"> </w:t>
       </w:r>
-      <w:hyperlink r:id="rId20">
+      <w:hyperlink r:id="rId23">
         <w:r>
           <w:rPr>
             <w:rStyle w:val="Hyperlink"/>
@@ -665,8 +708,8 @@
         <w:t xml:space="preserve">Remote-Arbeit: Verteilte Teamarbeit über GitHub (Branches, Pull Requests), Discord und Online-Calls</w:t>
       </w:r>
     </w:p>
-    <w:bookmarkEnd w:id="21"/>
-    <w:bookmarkEnd w:id="22"/>
+    <w:bookmarkEnd w:id="24"/>
+    <w:bookmarkEnd w:id="25"/>
     <w:sectPr>
       <w:footnotePr>
         <w:numRestart w:val="eachSect"/>

</xml_diff>

<commit_message>
feat(cv): GitHub-Leiste und Codebeispiele, Kundenprojekt nk247 nicht mehr genannt
- Entwickler-CV DE/EN: "57 meiner Pull Requests gemergt · Stand 29.09.2026"
  als nach Projekten geteilte, direkt beschriftete Leiste (Flowki Studio 50,
  Web-CV 4, Kundenprojekte 3) plus öffentliche Codebeispiele (Web-CV,
  MCP-Server für Club-Inhalte); ATS-Fassungen entsprechend
- Marketing-CV: Begleit-Repositories zu Club-Artikeln (MIT) mit
  UTM-Rückverweisen beim FlowKI Club
- Web-CV: Karte #github mit gemergten PRs je Woche (inkl. Nullwochen,
  laufende Woche markiert, private Repos nur gezählt) und Codebeispielen
  mit Prüfung und Grenze; Desktop-Direktlinks setzen die vom nativen
  Ankersprung verschobenen Container .win/.main zurück
- nk247 aus allen Fassungen entfernt (kleiner Kundenauftrag), ersetzt durch
  neutrale Zeile zu Kunden-Websites; Prüfskript verbietet den Namen
- ATS-Zeilenhöhe 1,25 (zwei Seiten trotz neuer GitHub-Zeilen)
</commit_message>
<xml_diff>
--- a/ats-cv/Jason_Roschmann_CV_ATS.docx
+++ b/ats-cv/Jason_Roschmann_CV_ATS.docx
@@ -2,7 +2,7 @@
 <file path=word/document.xml><?xml version="1.0" encoding="utf-8"?>
 <w:document xmlns:w="http://schemas.openxmlformats.org/wordprocessingml/2006/main" xmlns:m="http://schemas.openxmlformats.org/officeDocument/2006/math" xmlns:r="http://schemas.openxmlformats.org/officeDocument/2006/relationships" xmlns:o="urn:schemas-microsoft-com:office:office" xmlns:v="urn:schemas-microsoft-com:vml" xmlns:w10="urn:schemas-microsoft-com:office:word" xmlns:a="http://schemas.openxmlformats.org/drawingml/2006/main" xmlns:pic="http://schemas.openxmlformats.org/drawingml/2006/picture" xmlns:wp="http://schemas.openxmlformats.org/drawingml/2006/wordprocessingDrawing">
   <w:body>
-    <w:bookmarkStart w:id="25" w:name="jason-roschmann"/>
+    <w:bookmarkStart w:id="27" w:name="jason-roschmann"/>
     <w:p>
       <w:pPr>
         <w:pStyle w:val="Heading1"/>
@@ -507,7 +507,7 @@
         </w:numPr>
       </w:pPr>
       <w:r>
-        <w:t xml:space="preserve">nk247store.de (Kundenprojekt im Team): interaktive Überarbeitung mit Next.js und GSAP; CI mit TypeScript-Check, ESLint, Vitest, Build und Playwright. Meine Überarbeitung ist noch nicht veröffentlicht.</w:t>
+        <w:t xml:space="preserve">Kunden-Websites im Team gebaut: Next.js, GSAP, CI mit TypeScript-Check, ESLint, Vitest und Playwright.</w:t>
       </w:r>
     </w:p>
     <w:bookmarkEnd w:id="19"/>
@@ -546,7 +546,7 @@
     </w:p>
     <w:bookmarkEnd w:id="20"/>
     <w:bookmarkEnd w:id="21"/>
-    <w:bookmarkStart w:id="22" w:name="kenntnisse-arbeitsweise"/>
+    <w:bookmarkStart w:id="24" w:name="kenntnisse-arbeitsweise"/>
     <w:p>
       <w:pPr>
         <w:pStyle w:val="Heading2"/>
@@ -639,8 +639,60 @@
         <w:t xml:space="preserve">Mit KI-Agenten: Fehler zuerst als roter Test · Agent setzt um · ein zweites Modell prüft zusätzlich als Reviewer · Rollout mit Prüfsummen und automatischem Rückbau bei abgefangenen Fehlern</w:t>
       </w:r>
     </w:p>
-    <w:bookmarkEnd w:id="22"/>
-    <w:bookmarkStart w:id="24" w:name="weiterbildung-zertifikat-sprachen"/>
+    <w:p>
+      <w:pPr>
+        <w:pStyle w:val="Compact"/>
+        <w:numPr>
+          <w:ilvl w:val="0"/>
+          <w:numId w:val="1008"/>
+        </w:numPr>
+      </w:pPr>
+      <w:r>
+        <w:t xml:space="preserve">GitHub: 57 meiner Pull Requests gemergt (Stand 29.09.2026): Flowki Studio 50, Web-CV 4, Kundenprojekte 3</w:t>
+      </w:r>
+    </w:p>
+    <w:p>
+      <w:pPr>
+        <w:pStyle w:val="Compact"/>
+        <w:numPr>
+          <w:ilvl w:val="0"/>
+          <w:numId w:val="1008"/>
+        </w:numPr>
+      </w:pPr>
+      <w:r>
+        <w:t xml:space="preserve">Öffentliche Codebeispiele: Web-CV</w:t>
+      </w:r>
+      <w:r>
+        <w:t xml:space="preserve"> </w:t>
+      </w:r>
+      <w:hyperlink r:id="rId22">
+        <w:r>
+          <w:rPr>
+            <w:rStyle w:val="Hyperlink"/>
+          </w:rPr>
+          <w:t xml:space="preserve">https://github.com/JasonRoschmann/cv</w:t>
+        </w:r>
+      </w:hyperlink>
+      <w:r>
+        <w:t xml:space="preserve"> </w:t>
+      </w:r>
+      <w:r>
+        <w:t xml:space="preserve">· MCP-Server für Club-Inhalte</w:t>
+      </w:r>
+      <w:r>
+        <w:t xml:space="preserve"> </w:t>
+      </w:r>
+      <w:hyperlink r:id="rId23">
+        <w:r>
+          <w:rPr>
+            <w:rStyle w:val="Hyperlink"/>
+          </w:rPr>
+          <w:t xml:space="preserve">https://github.com/Jokersystems-online/flowki-knowledge-mcp</w:t>
+        </w:r>
+      </w:hyperlink>
+    </w:p>
+    <w:bookmarkEnd w:id="24"/>
+    <w:bookmarkStart w:id="26" w:name="weiterbildung-zertifikat-sprachen"/>
     <w:p>
       <w:pPr>
         <w:pStyle w:val="Heading2"/>
@@ -675,7 +727,7 @@
       <w:r>
         <w:t xml:space="preserve"> </w:t>
       </w:r>
-      <w:hyperlink r:id="rId23">
+      <w:hyperlink r:id="rId25">
         <w:r>
           <w:rPr>
             <w:rStyle w:val="Hyperlink"/>
@@ -708,8 +760,8 @@
         <w:t xml:space="preserve">Remote-Arbeit: Verteilte Teamarbeit über GitHub (Branches, Pull Requests), Discord und Online-Calls</w:t>
       </w:r>
     </w:p>
-    <w:bookmarkEnd w:id="24"/>
-    <w:bookmarkEnd w:id="25"/>
+    <w:bookmarkEnd w:id="26"/>
+    <w:bookmarkEnd w:id="27"/>
     <w:sectPr>
       <w:footnotePr>
         <w:numRestart w:val="eachSect"/>

</xml_diff>

<commit_message>
feat(cv): PR-Zahlen aus pr-stand.json, Summenlinie statt Wochenbalken
</commit_message>
<xml_diff>
--- a/ats-cv/Jason_Roschmann_CV_ATS.docx
+++ b/ats-cv/Jason_Roschmann_CV_ATS.docx
@@ -61,7 +61,19 @@
         <w:pStyle w:val="BodyText"/>
       </w:pPr>
       <w:r>
-        <w:t xml:space="preserve">Kennzahlen: 50 eigene Pull Requests gemergt (Flowki Studio) · 21 → 0 rote Tests (hermes-studio) · rund 66 Discord-Mitglieder FlowKI Club (Stand 29.09.2026) · 4 Jahre B2B-Vertrieb (2019–2023)</w:t>
+        <w:t xml:space="preserve">Kennzahlen:</w:t>
+      </w:r>
+      <w:r>
+        <w:t xml:space="preserve"> </w:t>
+      </w:r>
+      <w:r>
+        <w:t xml:space="preserve">50</w:t>
+      </w:r>
+      <w:r>
+        <w:t xml:space="preserve"> </w:t>
+      </w:r>
+      <w:r>
+        <w:t xml:space="preserve">eigene Pull Requests gemergt (Flowki Studio) · 21 → 0 rote Tests (hermes-studio) · rund 66 Discord-Mitglieder FlowKI Club (Stand 29.09.2026) · 4 Jahre B2B-Vertrieb (2019–2023)</w:t>
       </w:r>
     </w:p>
     <w:bookmarkEnd w:id="9"/>
@@ -88,7 +100,16 @@
         <w:pStyle w:val="FirstParagraph"/>
       </w:pPr>
       <w:r>
-        <w:t xml:space="preserve">Zweck: Internes Social-Media-Studio für Themenrecherche, KI-gestützte Content-Produktion, redaktionelle Prüfung und Plattformübergabe; mein Beitrag im Team (50 eigene Pull Requests gemergt): Produktoberflächen, Workflow-Integration, Clip-Verarbeitung und Publishing.</w:t>
+        <w:t xml:space="preserve">Zweck: Internes Social-Media-Studio für Themenrecherche, KI-gestützte Content-Produktion, redaktionelle Prüfung und Plattformübergabe; mein Beitrag im Team (</w:t>
+      </w:r>
+      <w:r>
+        <w:t xml:space="preserve">50</w:t>
+      </w:r>
+      <w:r>
+        <w:t xml:space="preserve"> </w:t>
+      </w:r>
+      <w:r>
+        <w:t xml:space="preserve">eigene Pull Requests gemergt): Produktoberflächen, Workflow-Integration, Clip-Verarbeitung und Publishing.</w:t>
       </w:r>
     </w:p>
     <w:p>
@@ -648,7 +669,52 @@
         </w:numPr>
       </w:pPr>
       <w:r>
-        <w:t xml:space="preserve">GitHub: 58 meiner Pull Requests gemergt (Stand 29.09.2026): Flowki Studio 50, Web-CV 5, Kundenprojekte 3</w:t>
+        <w:t xml:space="preserve">GitHub:</w:t>
+      </w:r>
+      <w:r>
+        <w:t xml:space="preserve"> </w:t>
+      </w:r>
+      <w:r>
+        <w:t xml:space="preserve">59</w:t>
+      </w:r>
+      <w:r>
+        <w:t xml:space="preserve"> </w:t>
+      </w:r>
+      <w:r>
+        <w:t xml:space="preserve">meiner Pull Requests gemergt (Stand</w:t>
+      </w:r>
+      <w:r>
+        <w:t xml:space="preserve"> </w:t>
+      </w:r>
+      <w:r>
+        <w:t xml:space="preserve">29.09.2026</w:t>
+      </w:r>
+      <w:r>
+        <w:t xml:space="preserve">): Flowki Studio</w:t>
+      </w:r>
+      <w:r>
+        <w:t xml:space="preserve"> </w:t>
+      </w:r>
+      <w:r>
+        <w:t xml:space="preserve">50</w:t>
+      </w:r>
+      <w:r>
+        <w:t xml:space="preserve">, eigene Repos</w:t>
+      </w:r>
+      <w:r>
+        <w:t xml:space="preserve"> </w:t>
+      </w:r>
+      <w:r>
+        <w:t xml:space="preserve">6</w:t>
+      </w:r>
+      <w:r>
+        <w:t xml:space="preserve">, Kundenprojekte</w:t>
+      </w:r>
+      <w:r>
+        <w:t xml:space="preserve"> </w:t>
+      </w:r>
+      <w:r>
+        <w:t xml:space="preserve">3</w:t>
       </w:r>
     </w:p>
     <w:p>

</xml_diff>